<commit_message>
feat(a11y): add WAI-ARIA Tabs keyboard navigation for worksheet switching
- Add tab-keyboard-nav.js with arrow key navigation, Home/End, and
  Alt+T global shortcut to jump to the tab strip
- Set role="tablist" and role="tab" with aria-selected on tab headers
- Add "Skip to worksheet tabs" as second skip link
- Update help text with keyboard navigation instructions
- Update all project documentation (ACCESSIBILITY, CHANGELOG, README,
  ARCHITECTURE, screen-reader-testing-guide, CONTRIBUTING, AI_TRANSPARENCY)

Fixes: Tab key only cycled through controls within the active worksheet
instead of allowing users to switch between worksheet tabs via keyboard.
</commit_message>
<xml_diff>
--- a/calculators/financial/ba-ii-plus/docs/Accessible_BA_II_Plus_User_Guide.docx
+++ b/calculators/financial/ba-ii-plus/docs/Accessible_BA_II_Plus_User_Guide.docx
@@ -136,15 +136,7 @@
         <w:spacing w:before="40" w:after="40"/>
       </w:pPr>
       <w:r>
-        <w:t xml:space="preserve">Open a terminal and navigate to the </w:t>
-      </w:r>
-      <w:proofErr w:type="spellStart"/>
-      <w:r>
-        <w:t>ba</w:t>
-      </w:r>
-      <w:proofErr w:type="spellEnd"/>
-      <w:r>
-        <w:t>-ii-plus project folder.</w:t>
+        <w:t>Open a terminal and navigate to the ba-ii-plus project folder.</w:t>
       </w:r>
     </w:p>
     <w:p>
@@ -200,15 +192,7 @@
         <w:spacing w:after="120"/>
       </w:pPr>
       <w:r>
-        <w:t xml:space="preserve">The page uses a proper heading hierarchy. Use your screen reader's heading navigation shortcut (H in NVDA/JAWS, </w:t>
-      </w:r>
-      <w:proofErr w:type="spellStart"/>
-      <w:r>
-        <w:t>VO+Command+H</w:t>
-      </w:r>
-      <w:proofErr w:type="spellEnd"/>
-      <w:r>
-        <w:t xml:space="preserve"> on macOS) to jump between sections:</w:t>
+        <w:t>The page uses a proper heading hierarchy. Use your screen reader's heading navigation shortcut (H in NVDA/JAWS, VO+Command+H on macOS) to jump between sections:</w:t>
       </w:r>
     </w:p>
     <w:p>
@@ -269,8 +253,101 @@
     </w:p>
     <w:p>
       <w:pPr>
+        <w:numPr>
+          <w:ilvl w:val="0"/>
+          <w:numId w:val="4"/>
+        </w:numPr>
+        <w:spacing w:after="120"/>
+      </w:pPr>
+      <w:r>
+        <w:rPr>
+          <w:b/>
+          <w:bCs/>
+        </w:rPr>
+        <w:t>Alt+T</w:t>
+      </w:r>
+      <w:r>
+        <w:t> — Jump to the tab strip from anywhere on the page</w:t>
+      </w:r>
+    </w:p>
+    <w:p>
+      <w:pPr>
+        <w:numPr>
+          <w:ilvl w:val="0"/>
+          <w:numId w:val="4"/>
+        </w:numPr>
+        <w:spacing w:after="120"/>
+      </w:pPr>
+      <w:r>
+        <w:rPr>
+          <w:b/>
+          <w:bCs/>
+        </w:rPr>
+        <w:t>Left / Right Arrow</w:t>
+      </w:r>
+      <w:r>
+        <w:t> — Move between worksheet tabs</w:t>
+      </w:r>
+    </w:p>
+    <w:p>
+      <w:pPr>
+        <w:numPr>
+          <w:ilvl w:val="0"/>
+          <w:numId w:val="4"/>
+        </w:numPr>
+        <w:spacing w:after="120"/>
+      </w:pPr>
+      <w:r>
+        <w:rPr>
+          <w:b/>
+          <w:bCs/>
+        </w:rPr>
+        <w:t>Home / End</w:t>
+      </w:r>
+      <w:r>
+        <w:t> — Jump to first / last tab</w:t>
+      </w:r>
+    </w:p>
+    <w:p>
+      <w:pPr>
+        <w:numPr>
+          <w:ilvl w:val="0"/>
+          <w:numId w:val="4"/>
+        </w:numPr>
+        <w:spacing w:after="120"/>
+      </w:pPr>
+      <w:r>
+        <w:rPr>
+          <w:b/>
+          <w:bCs/>
+        </w:rPr>
+        <w:t>Enter / Space</w:t>
+      </w:r>
+      <w:r>
+        <w:t> — Activate the focused tab</w:t>
+      </w:r>
+    </w:p>
+    <w:p>
+      <w:pPr>
+        <w:spacing w:after="120"/>
+      </w:pPr>
+    </w:p>
+    <w:p>
+      <w:pPr>
+        <w:spacing w:after="120"/>
+      </w:pPr>
+      <w:r>
+        <w:t>A "Skip to worksheet tabs" link is also available at the top of the page (second skip link after "Skip to calculator").</w:t>
+      </w:r>
+    </w:p>
+    <w:p>
+      <w:pPr>
         <w:spacing w:before="80" w:after="80"/>
         <w:ind w:left="360"/>
+        <w:rPr>
+          <w:sz w:val="20"/>
+          <w:szCs w:val="20"/>
+        </w:rPr>
       </w:pPr>
       <w:r>
         <w:rPr>
@@ -304,6 +381,7 @@
         <w:spacing w:after="120"/>
       </w:pPr>
       <w:r>
+        <w:lastRenderedPageBreak/>
         <w:t>Every input field has a visible label above it and help text below it. The label describes what the field means. The help text gives guidance such as the allowed range or format.</w:t>
       </w:r>
     </w:p>
@@ -344,7 +422,6 @@
         <w:spacing w:after="120"/>
       </w:pPr>
       <w:r>
-        <w:lastRenderedPageBreak/>
         <w:t>After clicking any Compute button, results appear in the result box below the buttons. The result box is a live region with role=status. The result is also announced in a hidden off-screen live region so you hear it even if your virtual cursor is elsewhere.</w:t>
       </w:r>
     </w:p>
@@ -477,23 +554,7 @@
         <w:spacing w:after="120"/>
       </w:pPr>
       <w:r>
-        <w:t xml:space="preserve">Click an operation button (+, -, x, ÷, </w:t>
-      </w:r>
-      <w:proofErr w:type="spellStart"/>
-      <w:r>
-        <w:t>x^y</w:t>
-      </w:r>
-      <w:proofErr w:type="spellEnd"/>
-      <w:r>
-        <w:t xml:space="preserve">, </w:t>
-      </w:r>
-      <w:proofErr w:type="spellStart"/>
-      <w:r>
-        <w:t>nCr</w:t>
-      </w:r>
-      <w:proofErr w:type="spellEnd"/>
-      <w:r>
-        <w:t>, nPr), then enter the second number, then press = (Equals).</w:t>
+        <w:t>Click an operation button (+, -, x, ÷, x^y, nCr, nPr), then enter the second number, then press = (Equals).</w:t>
       </w:r>
     </w:p>
     <w:p>
@@ -501,15 +562,7 @@
         <w:spacing w:after="120"/>
       </w:pPr>
       <w:r>
-        <w:t xml:space="preserve">Unary operations (square root, reciprocal, %, ln, </w:t>
-      </w:r>
-      <w:proofErr w:type="spellStart"/>
-      <w:r>
-        <w:t>e^x</w:t>
-      </w:r>
-      <w:proofErr w:type="spellEnd"/>
-      <w:r>
-        <w:t>, n!) are applied immediately to the displayed number — no second operand needed.</w:t>
+        <w:t>Unary operations (square root, reciprocal, %, ln, e^x, n!) are applied immediately to the displayed number — no second operand needed.</w:t>
       </w:r>
     </w:p>
     <w:p/>
@@ -696,12 +749,6 @@
         <w:gridCol w:w="830"/>
       </w:tblGrid>
       <w:tr>
-        <w:tblPrEx>
-          <w:tblCellMar>
-            <w:top w:w="0" w:type="dxa"/>
-            <w:bottom w:w="0" w:type="dxa"/>
-          </w:tblCellMar>
-        </w:tblPrEx>
         <w:trPr>
           <w:tblHeader/>
         </w:trPr>
@@ -888,12 +935,6 @@
         </w:tc>
       </w:tr>
       <w:tr>
-        <w:tblPrEx>
-          <w:tblCellMar>
-            <w:top w:w="0" w:type="dxa"/>
-            <w:bottom w:w="0" w:type="dxa"/>
-          </w:tblCellMar>
-        </w:tblPrEx>
         <w:tc>
           <w:tcPr>
             <w:tcW w:w="500" w:type="dxa"/>
@@ -1047,12 +1088,6 @@
         </w:tc>
       </w:tr>
       <w:tr>
-        <w:tblPrEx>
-          <w:tblCellMar>
-            <w:top w:w="0" w:type="dxa"/>
-            <w:bottom w:w="0" w:type="dxa"/>
-          </w:tblCellMar>
-        </w:tblPrEx>
         <w:tc>
           <w:tcPr>
             <w:tcW w:w="500" w:type="dxa"/>
@@ -1206,12 +1241,6 @@
         </w:tc>
       </w:tr>
       <w:tr>
-        <w:tblPrEx>
-          <w:tblCellMar>
-            <w:top w:w="0" w:type="dxa"/>
-            <w:bottom w:w="0" w:type="dxa"/>
-          </w:tblCellMar>
-        </w:tblPrEx>
         <w:tc>
           <w:tcPr>
             <w:tcW w:w="500" w:type="dxa"/>
@@ -1365,12 +1394,6 @@
         </w:tc>
       </w:tr>
       <w:tr>
-        <w:tblPrEx>
-          <w:tblCellMar>
-            <w:top w:w="0" w:type="dxa"/>
-            <w:bottom w:w="0" w:type="dxa"/>
-          </w:tblCellMar>
-        </w:tblPrEx>
         <w:tc>
           <w:tcPr>
             <w:tcW w:w="500" w:type="dxa"/>
@@ -1524,12 +1547,6 @@
         </w:tc>
       </w:tr>
       <w:tr>
-        <w:tblPrEx>
-          <w:tblCellMar>
-            <w:top w:w="0" w:type="dxa"/>
-            <w:bottom w:w="0" w:type="dxa"/>
-          </w:tblCellMar>
-        </w:tblPrEx>
         <w:tc>
           <w:tcPr>
             <w:tcW w:w="500" w:type="dxa"/>
@@ -1683,12 +1700,6 @@
         </w:tc>
       </w:tr>
       <w:tr>
-        <w:tblPrEx>
-          <w:tblCellMar>
-            <w:top w:w="0" w:type="dxa"/>
-            <w:bottom w:w="0" w:type="dxa"/>
-          </w:tblCellMar>
-        </w:tblPrEx>
         <w:tc>
           <w:tcPr>
             <w:tcW w:w="500" w:type="dxa"/>
@@ -1737,17 +1748,8 @@
                 <w:sz w:val="20"/>
                 <w:szCs w:val="20"/>
               </w:rPr>
-              <w:t xml:space="preserve">Power </w:t>
-            </w:r>
-            <w:proofErr w:type="spellStart"/>
-            <w:r>
-              <w:rPr>
-                <w:sz w:val="20"/>
-                <w:szCs w:val="20"/>
-              </w:rPr>
-              <w:t>x^y</w:t>
-            </w:r>
-            <w:proofErr w:type="spellEnd"/>
+              <w:t>Power x^y</w:t>
+            </w:r>
           </w:p>
         </w:tc>
         <w:tc>
@@ -1772,23 +1774,7 @@
                 <w:sz w:val="20"/>
                 <w:szCs w:val="20"/>
               </w:rPr>
-              <w:t xml:space="preserve">Press 3, </w:t>
-            </w:r>
-            <w:proofErr w:type="spellStart"/>
-            <w:r>
-              <w:rPr>
-                <w:sz w:val="20"/>
-                <w:szCs w:val="20"/>
-              </w:rPr>
-              <w:t>x^y</w:t>
-            </w:r>
-            <w:proofErr w:type="spellEnd"/>
-            <w:r>
-              <w:rPr>
-                <w:sz w:val="20"/>
-                <w:szCs w:val="20"/>
-              </w:rPr>
-              <w:t>, 1.25, =</w:t>
+              <w:t>Press 3, x^y, 1.25, =</w:t>
             </w:r>
           </w:p>
         </w:tc>
@@ -1867,12 +1853,6 @@
         </w:tc>
       </w:tr>
       <w:tr>
-        <w:tblPrEx>
-          <w:tblCellMar>
-            <w:top w:w="0" w:type="dxa"/>
-            <w:bottom w:w="0" w:type="dxa"/>
-          </w:tblCellMar>
-        </w:tblPrEx>
         <w:tc>
           <w:tcPr>
             <w:tcW w:w="500" w:type="dxa"/>
@@ -2026,12 +2006,6 @@
         </w:tc>
       </w:tr>
       <w:tr>
-        <w:tblPrEx>
-          <w:tblCellMar>
-            <w:top w:w="0" w:type="dxa"/>
-            <w:bottom w:w="0" w:type="dxa"/>
-          </w:tblCellMar>
-        </w:tblPrEx>
         <w:tc>
           <w:tcPr>
             <w:tcW w:w="500" w:type="dxa"/>
@@ -2185,12 +2159,6 @@
         </w:tc>
       </w:tr>
       <w:tr>
-        <w:tblPrEx>
-          <w:tblCellMar>
-            <w:top w:w="0" w:type="dxa"/>
-            <w:bottom w:w="0" w:type="dxa"/>
-          </w:tblCellMar>
-        </w:tblPrEx>
         <w:tc>
           <w:tcPr>
             <w:tcW w:w="500" w:type="dxa"/>
@@ -2344,12 +2312,6 @@
         </w:tc>
       </w:tr>
       <w:tr>
-        <w:tblPrEx>
-          <w:tblCellMar>
-            <w:top w:w="0" w:type="dxa"/>
-            <w:bottom w:w="0" w:type="dxa"/>
-          </w:tblCellMar>
-        </w:tblPrEx>
         <w:tc>
           <w:tcPr>
             <w:tcW w:w="500" w:type="dxa"/>
@@ -2503,12 +2465,6 @@
         </w:tc>
       </w:tr>
       <w:tr>
-        <w:tblPrEx>
-          <w:tblCellMar>
-            <w:top w:w="0" w:type="dxa"/>
-            <w:bottom w:w="0" w:type="dxa"/>
-          </w:tblCellMar>
-        </w:tblPrEx>
         <w:tc>
           <w:tcPr>
             <w:tcW w:w="500" w:type="dxa"/>
@@ -2662,12 +2618,6 @@
         </w:tc>
       </w:tr>
       <w:tr>
-        <w:tblPrEx>
-          <w:tblCellMar>
-            <w:top w:w="0" w:type="dxa"/>
-            <w:bottom w:w="0" w:type="dxa"/>
-          </w:tblCellMar>
-        </w:tblPrEx>
         <w:tc>
           <w:tcPr>
             <w:tcW w:w="500" w:type="dxa"/>
@@ -2716,17 +2666,8 @@
                 <w:sz w:val="20"/>
                 <w:szCs w:val="20"/>
               </w:rPr>
-              <w:t xml:space="preserve">Exponential </w:t>
-            </w:r>
-            <w:proofErr w:type="spellStart"/>
-            <w:r>
-              <w:rPr>
-                <w:sz w:val="20"/>
-                <w:szCs w:val="20"/>
-              </w:rPr>
-              <w:t>e^x</w:t>
-            </w:r>
-            <w:proofErr w:type="spellEnd"/>
+              <w:t>Exponential e^x</w:t>
+            </w:r>
           </w:p>
         </w:tc>
         <w:tc>
@@ -2751,17 +2692,8 @@
                 <w:sz w:val="20"/>
                 <w:szCs w:val="20"/>
               </w:rPr>
-              <w:t xml:space="preserve">Press 0.69315, </w:t>
-            </w:r>
-            <w:proofErr w:type="spellStart"/>
-            <w:r>
-              <w:rPr>
-                <w:sz w:val="20"/>
-                <w:szCs w:val="20"/>
-              </w:rPr>
-              <w:t>e^x</w:t>
-            </w:r>
-            <w:proofErr w:type="spellEnd"/>
+              <w:t>Press 0.69315, e^x</w:t>
+            </w:r>
           </w:p>
         </w:tc>
         <w:tc>
@@ -2839,12 +2771,6 @@
         </w:tc>
       </w:tr>
       <w:tr>
-        <w:tblPrEx>
-          <w:tblCellMar>
-            <w:top w:w="0" w:type="dxa"/>
-            <w:bottom w:w="0" w:type="dxa"/>
-          </w:tblCellMar>
-        </w:tblPrEx>
         <w:tc>
           <w:tcPr>
             <w:tcW w:w="500" w:type="dxa"/>
@@ -2998,12 +2924,6 @@
         </w:tc>
       </w:tr>
       <w:tr>
-        <w:tblPrEx>
-          <w:tblCellMar>
-            <w:top w:w="0" w:type="dxa"/>
-            <w:bottom w:w="0" w:type="dxa"/>
-          </w:tblCellMar>
-        </w:tblPrEx>
         <w:tc>
           <w:tcPr>
             <w:tcW w:w="500" w:type="dxa"/>
@@ -3157,12 +3077,6 @@
         </w:tc>
       </w:tr>
       <w:tr>
-        <w:tblPrEx>
-          <w:tblCellMar>
-            <w:top w:w="0" w:type="dxa"/>
-            <w:bottom w:w="0" w:type="dxa"/>
-          </w:tblCellMar>
-        </w:tblPrEx>
         <w:tc>
           <w:tcPr>
             <w:tcW w:w="500" w:type="dxa"/>
@@ -3316,12 +3230,6 @@
         </w:tc>
       </w:tr>
       <w:tr>
-        <w:tblPrEx>
-          <w:tblCellMar>
-            <w:top w:w="0" w:type="dxa"/>
-            <w:bottom w:w="0" w:type="dxa"/>
-          </w:tblCellMar>
-        </w:tblPrEx>
         <w:tc>
           <w:tcPr>
             <w:tcW w:w="500" w:type="dxa"/>
@@ -3370,17 +3278,8 @@
                 <w:sz w:val="20"/>
                 <w:szCs w:val="20"/>
               </w:rPr>
-              <w:t xml:space="preserve">Combinations </w:t>
-            </w:r>
-            <w:proofErr w:type="spellStart"/>
-            <w:r>
-              <w:rPr>
-                <w:sz w:val="20"/>
-                <w:szCs w:val="20"/>
-              </w:rPr>
-              <w:t>nCr</w:t>
-            </w:r>
-            <w:proofErr w:type="spellEnd"/>
+              <w:t>Combinations nCr</w:t>
+            </w:r>
           </w:p>
         </w:tc>
         <w:tc>
@@ -3405,23 +3304,7 @@
                 <w:sz w:val="20"/>
                 <w:szCs w:val="20"/>
               </w:rPr>
-              <w:t xml:space="preserve">Press 52, </w:t>
-            </w:r>
-            <w:proofErr w:type="spellStart"/>
-            <w:r>
-              <w:rPr>
-                <w:sz w:val="20"/>
-                <w:szCs w:val="20"/>
-              </w:rPr>
-              <w:t>nCr</w:t>
-            </w:r>
-            <w:proofErr w:type="spellEnd"/>
-            <w:r>
-              <w:rPr>
-                <w:sz w:val="20"/>
-                <w:szCs w:val="20"/>
-              </w:rPr>
-              <w:t>, 5, =</w:t>
+              <w:t>Press 52, nCr, 5, =</w:t>
             </w:r>
           </w:p>
         </w:tc>
@@ -3500,12 +3383,6 @@
         </w:tc>
       </w:tr>
       <w:tr>
-        <w:tblPrEx>
-          <w:tblCellMar>
-            <w:top w:w="0" w:type="dxa"/>
-            <w:bottom w:w="0" w:type="dxa"/>
-          </w:tblCellMar>
-        </w:tblPrEx>
         <w:tc>
           <w:tcPr>
             <w:tcW w:w="500" w:type="dxa"/>
@@ -3659,12 +3536,6 @@
         </w:tc>
       </w:tr>
       <w:tr>
-        <w:tblPrEx>
-          <w:tblCellMar>
-            <w:top w:w="0" w:type="dxa"/>
-            <w:bottom w:w="0" w:type="dxa"/>
-          </w:tblCellMar>
-        </w:tblPrEx>
         <w:tc>
           <w:tcPr>
             <w:tcW w:w="500" w:type="dxa"/>
@@ -3739,23 +3610,7 @@
                 <w:sz w:val="20"/>
                 <w:szCs w:val="20"/>
               </w:rPr>
-              <w:t xml:space="preserve">Press 3, </w:t>
-            </w:r>
-            <w:proofErr w:type="spellStart"/>
-            <w:r>
-              <w:rPr>
-                <w:sz w:val="20"/>
-                <w:szCs w:val="20"/>
-              </w:rPr>
-              <w:t>nCr</w:t>
-            </w:r>
-            <w:proofErr w:type="spellEnd"/>
-            <w:r>
-              <w:rPr>
-                <w:sz w:val="20"/>
-                <w:szCs w:val="20"/>
-              </w:rPr>
-              <w:t>, 5, =</w:t>
+              <w:t>Press 3, nCr, 5, =</w:t>
             </w:r>
           </w:p>
         </w:tc>
@@ -3834,12 +3689,6 @@
         </w:tc>
       </w:tr>
       <w:tr>
-        <w:tblPrEx>
-          <w:tblCellMar>
-            <w:top w:w="0" w:type="dxa"/>
-            <w:bottom w:w="0" w:type="dxa"/>
-          </w:tblCellMar>
-        </w:tblPrEx>
         <w:tc>
           <w:tcPr>
             <w:tcW w:w="500" w:type="dxa"/>
@@ -4028,12 +3877,6 @@
         <w:gridCol w:w="830"/>
       </w:tblGrid>
       <w:tr>
-        <w:tblPrEx>
-          <w:tblCellMar>
-            <w:top w:w="0" w:type="dxa"/>
-            <w:bottom w:w="0" w:type="dxa"/>
-          </w:tblCellMar>
-        </w:tblPrEx>
         <w:trPr>
           <w:tblHeader/>
         </w:trPr>
@@ -4220,12 +4063,6 @@
         </w:tc>
       </w:tr>
       <w:tr>
-        <w:tblPrEx>
-          <w:tblCellMar>
-            <w:top w:w="0" w:type="dxa"/>
-            <w:bottom w:w="0" w:type="dxa"/>
-          </w:tblCellMar>
-        </w:tblPrEx>
         <w:tc>
           <w:tcPr>
             <w:tcW w:w="500" w:type="dxa"/>
@@ -4379,12 +4216,6 @@
         </w:tc>
       </w:tr>
       <w:tr>
-        <w:tblPrEx>
-          <w:tblCellMar>
-            <w:top w:w="0" w:type="dxa"/>
-            <w:bottom w:w="0" w:type="dxa"/>
-          </w:tblCellMar>
-        </w:tblPrEx>
         <w:tc>
           <w:tcPr>
             <w:tcW w:w="500" w:type="dxa"/>
@@ -4538,12 +4369,6 @@
         </w:tc>
       </w:tr>
       <w:tr>
-        <w:tblPrEx>
-          <w:tblCellMar>
-            <w:top w:w="0" w:type="dxa"/>
-            <w:bottom w:w="0" w:type="dxa"/>
-          </w:tblCellMar>
-        </w:tblPrEx>
         <w:tc>
           <w:tcPr>
             <w:tcW w:w="500" w:type="dxa"/>
@@ -4697,12 +4522,6 @@
         </w:tc>
       </w:tr>
       <w:tr>
-        <w:tblPrEx>
-          <w:tblCellMar>
-            <w:top w:w="0" w:type="dxa"/>
-            <w:bottom w:w="0" w:type="dxa"/>
-          </w:tblCellMar>
-        </w:tblPrEx>
         <w:tc>
           <w:tcPr>
             <w:tcW w:w="500" w:type="dxa"/>
@@ -4856,12 +4675,6 @@
         </w:tc>
       </w:tr>
       <w:tr>
-        <w:tblPrEx>
-          <w:tblCellMar>
-            <w:top w:w="0" w:type="dxa"/>
-            <w:bottom w:w="0" w:type="dxa"/>
-          </w:tblCellMar>
-        </w:tblPrEx>
         <w:tc>
           <w:tcPr>
             <w:tcW w:w="500" w:type="dxa"/>
@@ -5015,12 +4828,6 @@
         </w:tc>
       </w:tr>
       <w:tr>
-        <w:tblPrEx>
-          <w:tblCellMar>
-            <w:top w:w="0" w:type="dxa"/>
-            <w:bottom w:w="0" w:type="dxa"/>
-          </w:tblCellMar>
-        </w:tblPrEx>
         <w:tc>
           <w:tcPr>
             <w:tcW w:w="500" w:type="dxa"/>
@@ -5229,12 +5036,6 @@
         <w:gridCol w:w="3109"/>
       </w:tblGrid>
       <w:tr>
-        <w:tblPrEx>
-          <w:tblCellMar>
-            <w:top w:w="0" w:type="dxa"/>
-            <w:bottom w:w="0" w:type="dxa"/>
-          </w:tblCellMar>
-        </w:tblPrEx>
         <w:trPr>
           <w:tblHeader/>
         </w:trPr>
@@ -5360,12 +5161,6 @@
         </w:tc>
       </w:tr>
       <w:tr>
-        <w:tblPrEx>
-          <w:tblCellMar>
-            <w:top w:w="0" w:type="dxa"/>
-            <w:bottom w:w="0" w:type="dxa"/>
-          </w:tblCellMar>
-        </w:tblPrEx>
         <w:tc>
           <w:tcPr>
             <w:tcW w:w="900" w:type="dxa"/>
@@ -5472,12 +5267,6 @@
         </w:tc>
       </w:tr>
       <w:tr>
-        <w:tblPrEx>
-          <w:tblCellMar>
-            <w:top w:w="0" w:type="dxa"/>
-            <w:bottom w:w="0" w:type="dxa"/>
-          </w:tblCellMar>
-        </w:tblPrEx>
         <w:tc>
           <w:tcPr>
             <w:tcW w:w="900" w:type="dxa"/>
@@ -5588,12 +5377,6 @@
         </w:tc>
       </w:tr>
       <w:tr>
-        <w:tblPrEx>
-          <w:tblCellMar>
-            <w:top w:w="0" w:type="dxa"/>
-            <w:bottom w:w="0" w:type="dxa"/>
-          </w:tblCellMar>
-        </w:tblPrEx>
         <w:tc>
           <w:tcPr>
             <w:tcW w:w="900" w:type="dxa"/>
@@ -5700,12 +5483,6 @@
         </w:tc>
       </w:tr>
       <w:tr>
-        <w:tblPrEx>
-          <w:tblCellMar>
-            <w:top w:w="0" w:type="dxa"/>
-            <w:bottom w:w="0" w:type="dxa"/>
-          </w:tblCellMar>
-        </w:tblPrEx>
         <w:tc>
           <w:tcPr>
             <w:tcW w:w="900" w:type="dxa"/>
@@ -5816,12 +5593,6 @@
         </w:tc>
       </w:tr>
       <w:tr>
-        <w:tblPrEx>
-          <w:tblCellMar>
-            <w:top w:w="0" w:type="dxa"/>
-            <w:bottom w:w="0" w:type="dxa"/>
-          </w:tblCellMar>
-        </w:tblPrEx>
         <w:tc>
           <w:tcPr>
             <w:tcW w:w="900" w:type="dxa"/>
@@ -5928,12 +5699,6 @@
         </w:tc>
       </w:tr>
       <w:tr>
-        <w:tblPrEx>
-          <w:tblCellMar>
-            <w:top w:w="0" w:type="dxa"/>
-            <w:bottom w:w="0" w:type="dxa"/>
-          </w:tblCellMar>
-        </w:tblPrEx>
         <w:tc>
           <w:tcPr>
             <w:tcW w:w="900" w:type="dxa"/>
@@ -6044,12 +5809,6 @@
         </w:tc>
       </w:tr>
       <w:tr>
-        <w:tblPrEx>
-          <w:tblCellMar>
-            <w:top w:w="0" w:type="dxa"/>
-            <w:bottom w:w="0" w:type="dxa"/>
-          </w:tblCellMar>
-        </w:tblPrEx>
         <w:tc>
           <w:tcPr>
             <w:tcW w:w="900" w:type="dxa"/>
@@ -6369,12 +6128,6 @@
         <w:gridCol w:w="6360"/>
       </w:tblGrid>
       <w:tr>
-        <w:tblPrEx>
-          <w:tblCellMar>
-            <w:top w:w="0" w:type="dxa"/>
-            <w:bottom w:w="0" w:type="dxa"/>
-          </w:tblCellMar>
-        </w:tblPrEx>
         <w:trPr>
           <w:tblHeader/>
         </w:trPr>
@@ -6440,12 +6193,6 @@
         </w:tc>
       </w:tr>
       <w:tr>
-        <w:tblPrEx>
-          <w:tblCellMar>
-            <w:top w:w="0" w:type="dxa"/>
-            <w:bottom w:w="0" w:type="dxa"/>
-          </w:tblCellMar>
-        </w:tblPrEx>
         <w:tc>
           <w:tcPr>
             <w:tcW w:w="3000" w:type="dxa"/>
@@ -6500,12 +6247,6 @@
         </w:tc>
       </w:tr>
       <w:tr>
-        <w:tblPrEx>
-          <w:tblCellMar>
-            <w:top w:w="0" w:type="dxa"/>
-            <w:bottom w:w="0" w:type="dxa"/>
-          </w:tblCellMar>
-        </w:tblPrEx>
         <w:tc>
           <w:tcPr>
             <w:tcW w:w="3000" w:type="dxa"/>
@@ -6562,12 +6303,6 @@
         </w:tc>
       </w:tr>
       <w:tr>
-        <w:tblPrEx>
-          <w:tblCellMar>
-            <w:top w:w="0" w:type="dxa"/>
-            <w:bottom w:w="0" w:type="dxa"/>
-          </w:tblCellMar>
-        </w:tblPrEx>
         <w:tc>
           <w:tcPr>
             <w:tcW w:w="3000" w:type="dxa"/>
@@ -6622,12 +6357,6 @@
         </w:tc>
       </w:tr>
       <w:tr>
-        <w:tblPrEx>
-          <w:tblCellMar>
-            <w:top w:w="0" w:type="dxa"/>
-            <w:bottom w:w="0" w:type="dxa"/>
-          </w:tblCellMar>
-        </w:tblPrEx>
         <w:tc>
           <w:tcPr>
             <w:tcW w:w="3000" w:type="dxa"/>
@@ -6684,12 +6413,6 @@
         </w:tc>
       </w:tr>
       <w:tr>
-        <w:tblPrEx>
-          <w:tblCellMar>
-            <w:top w:w="0" w:type="dxa"/>
-            <w:bottom w:w="0" w:type="dxa"/>
-          </w:tblCellMar>
-        </w:tblPrEx>
         <w:tc>
           <w:tcPr>
             <w:tcW w:w="3000" w:type="dxa"/>
@@ -6744,12 +6467,6 @@
         </w:tc>
       </w:tr>
       <w:tr>
-        <w:tblPrEx>
-          <w:tblCellMar>
-            <w:top w:w="0" w:type="dxa"/>
-            <w:bottom w:w="0" w:type="dxa"/>
-          </w:tblCellMar>
-        </w:tblPrEx>
         <w:tc>
           <w:tcPr>
             <w:tcW w:w="3000" w:type="dxa"/>
@@ -6806,12 +6523,6 @@
         </w:tc>
       </w:tr>
       <w:tr>
-        <w:tblPrEx>
-          <w:tblCellMar>
-            <w:top w:w="0" w:type="dxa"/>
-            <w:bottom w:w="0" w:type="dxa"/>
-          </w:tblCellMar>
-        </w:tblPrEx>
         <w:tc>
           <w:tcPr>
             <w:tcW w:w="3000" w:type="dxa"/>
@@ -6928,12 +6639,6 @@
         <w:gridCol w:w="6360"/>
       </w:tblGrid>
       <w:tr>
-        <w:tblPrEx>
-          <w:tblCellMar>
-            <w:top w:w="0" w:type="dxa"/>
-            <w:bottom w:w="0" w:type="dxa"/>
-          </w:tblCellMar>
-        </w:tblPrEx>
         <w:trPr>
           <w:tblHeader/>
         </w:trPr>
@@ -6999,12 +6704,6 @@
         </w:tc>
       </w:tr>
       <w:tr>
-        <w:tblPrEx>
-          <w:tblCellMar>
-            <w:top w:w="0" w:type="dxa"/>
-            <w:bottom w:w="0" w:type="dxa"/>
-          </w:tblCellMar>
-        </w:tblPrEx>
         <w:tc>
           <w:tcPr>
             <w:tcW w:w="3000" w:type="dxa"/>
@@ -7059,12 +6758,6 @@
         </w:tc>
       </w:tr>
       <w:tr>
-        <w:tblPrEx>
-          <w:tblCellMar>
-            <w:top w:w="0" w:type="dxa"/>
-            <w:bottom w:w="0" w:type="dxa"/>
-          </w:tblCellMar>
-        </w:tblPrEx>
         <w:tc>
           <w:tcPr>
             <w:tcW w:w="3000" w:type="dxa"/>
@@ -7121,12 +6814,6 @@
         </w:tc>
       </w:tr>
       <w:tr>
-        <w:tblPrEx>
-          <w:tblCellMar>
-            <w:top w:w="0" w:type="dxa"/>
-            <w:bottom w:w="0" w:type="dxa"/>
-          </w:tblCellMar>
-        </w:tblPrEx>
         <w:tc>
           <w:tcPr>
             <w:tcW w:w="3000" w:type="dxa"/>
@@ -7181,12 +6868,6 @@
         </w:tc>
       </w:tr>
       <w:tr>
-        <w:tblPrEx>
-          <w:tblCellMar>
-            <w:top w:w="0" w:type="dxa"/>
-            <w:bottom w:w="0" w:type="dxa"/>
-          </w:tblCellMar>
-        </w:tblPrEx>
         <w:tc>
           <w:tcPr>
             <w:tcW w:w="3000" w:type="dxa"/>
@@ -7243,12 +6924,6 @@
         </w:tc>
       </w:tr>
       <w:tr>
-        <w:tblPrEx>
-          <w:tblCellMar>
-            <w:top w:w="0" w:type="dxa"/>
-            <w:bottom w:w="0" w:type="dxa"/>
-          </w:tblCellMar>
-        </w:tblPrEx>
         <w:tc>
           <w:tcPr>
             <w:tcW w:w="3000" w:type="dxa"/>
@@ -7303,12 +6978,6 @@
         </w:tc>
       </w:tr>
       <w:tr>
-        <w:tblPrEx>
-          <w:tblCellMar>
-            <w:top w:w="0" w:type="dxa"/>
-            <w:bottom w:w="0" w:type="dxa"/>
-          </w:tblCellMar>
-        </w:tblPrEx>
         <w:tc>
           <w:tcPr>
             <w:tcW w:w="3000" w:type="dxa"/>
@@ -7365,12 +7034,6 @@
         </w:tc>
       </w:tr>
       <w:tr>
-        <w:tblPrEx>
-          <w:tblCellMar>
-            <w:top w:w="0" w:type="dxa"/>
-            <w:bottom w:w="0" w:type="dxa"/>
-          </w:tblCellMar>
-        </w:tblPrEx>
         <w:tc>
           <w:tcPr>
             <w:tcW w:w="3000" w:type="dxa"/>
@@ -7488,12 +7151,6 @@
         <w:gridCol w:w="6360"/>
       </w:tblGrid>
       <w:tr>
-        <w:tblPrEx>
-          <w:tblCellMar>
-            <w:top w:w="0" w:type="dxa"/>
-            <w:bottom w:w="0" w:type="dxa"/>
-          </w:tblCellMar>
-        </w:tblPrEx>
         <w:trPr>
           <w:tblHeader/>
         </w:trPr>
@@ -7559,12 +7216,6 @@
         </w:tc>
       </w:tr>
       <w:tr>
-        <w:tblPrEx>
-          <w:tblCellMar>
-            <w:top w:w="0" w:type="dxa"/>
-            <w:bottom w:w="0" w:type="dxa"/>
-          </w:tblCellMar>
-        </w:tblPrEx>
         <w:tc>
           <w:tcPr>
             <w:tcW w:w="3000" w:type="dxa"/>
@@ -7619,12 +7270,6 @@
         </w:tc>
       </w:tr>
       <w:tr>
-        <w:tblPrEx>
-          <w:tblCellMar>
-            <w:top w:w="0" w:type="dxa"/>
-            <w:bottom w:w="0" w:type="dxa"/>
-          </w:tblCellMar>
-        </w:tblPrEx>
         <w:tc>
           <w:tcPr>
             <w:tcW w:w="3000" w:type="dxa"/>
@@ -7681,12 +7326,6 @@
         </w:tc>
       </w:tr>
       <w:tr>
-        <w:tblPrEx>
-          <w:tblCellMar>
-            <w:top w:w="0" w:type="dxa"/>
-            <w:bottom w:w="0" w:type="dxa"/>
-          </w:tblCellMar>
-        </w:tblPrEx>
         <w:tc>
           <w:tcPr>
             <w:tcW w:w="3000" w:type="dxa"/>
@@ -7741,12 +7380,6 @@
         </w:tc>
       </w:tr>
       <w:tr>
-        <w:tblPrEx>
-          <w:tblCellMar>
-            <w:top w:w="0" w:type="dxa"/>
-            <w:bottom w:w="0" w:type="dxa"/>
-          </w:tblCellMar>
-        </w:tblPrEx>
         <w:tc>
           <w:tcPr>
             <w:tcW w:w="3000" w:type="dxa"/>
@@ -7803,12 +7436,6 @@
         </w:tc>
       </w:tr>
       <w:tr>
-        <w:tblPrEx>
-          <w:tblCellMar>
-            <w:top w:w="0" w:type="dxa"/>
-            <w:bottom w:w="0" w:type="dxa"/>
-          </w:tblCellMar>
-        </w:tblPrEx>
         <w:tc>
           <w:tcPr>
             <w:tcW w:w="3000" w:type="dxa"/>
@@ -7863,12 +7490,6 @@
         </w:tc>
       </w:tr>
       <w:tr>
-        <w:tblPrEx>
-          <w:tblCellMar>
-            <w:top w:w="0" w:type="dxa"/>
-            <w:bottom w:w="0" w:type="dxa"/>
-          </w:tblCellMar>
-        </w:tblPrEx>
         <w:tc>
           <w:tcPr>
             <w:tcW w:w="3000" w:type="dxa"/>
@@ -7925,12 +7546,6 @@
         </w:tc>
       </w:tr>
       <w:tr>
-        <w:tblPrEx>
-          <w:tblCellMar>
-            <w:top w:w="0" w:type="dxa"/>
-            <w:bottom w:w="0" w:type="dxa"/>
-          </w:tblCellMar>
-        </w:tblPrEx>
         <w:tc>
           <w:tcPr>
             <w:tcW w:w="3000" w:type="dxa"/>
@@ -8047,12 +7662,6 @@
         <w:gridCol w:w="6360"/>
       </w:tblGrid>
       <w:tr>
-        <w:tblPrEx>
-          <w:tblCellMar>
-            <w:top w:w="0" w:type="dxa"/>
-            <w:bottom w:w="0" w:type="dxa"/>
-          </w:tblCellMar>
-        </w:tblPrEx>
         <w:trPr>
           <w:tblHeader/>
         </w:trPr>
@@ -8118,12 +7727,6 @@
         </w:tc>
       </w:tr>
       <w:tr>
-        <w:tblPrEx>
-          <w:tblCellMar>
-            <w:top w:w="0" w:type="dxa"/>
-            <w:bottom w:w="0" w:type="dxa"/>
-          </w:tblCellMar>
-        </w:tblPrEx>
         <w:tc>
           <w:tcPr>
             <w:tcW w:w="3000" w:type="dxa"/>
@@ -8178,12 +7781,6 @@
         </w:tc>
       </w:tr>
       <w:tr>
-        <w:tblPrEx>
-          <w:tblCellMar>
-            <w:top w:w="0" w:type="dxa"/>
-            <w:bottom w:w="0" w:type="dxa"/>
-          </w:tblCellMar>
-        </w:tblPrEx>
         <w:tc>
           <w:tcPr>
             <w:tcW w:w="3000" w:type="dxa"/>
@@ -8240,12 +7837,6 @@
         </w:tc>
       </w:tr>
       <w:tr>
-        <w:tblPrEx>
-          <w:tblCellMar>
-            <w:top w:w="0" w:type="dxa"/>
-            <w:bottom w:w="0" w:type="dxa"/>
-          </w:tblCellMar>
-        </w:tblPrEx>
         <w:tc>
           <w:tcPr>
             <w:tcW w:w="3000" w:type="dxa"/>
@@ -8300,12 +7891,6 @@
         </w:tc>
       </w:tr>
       <w:tr>
-        <w:tblPrEx>
-          <w:tblCellMar>
-            <w:top w:w="0" w:type="dxa"/>
-            <w:bottom w:w="0" w:type="dxa"/>
-          </w:tblCellMar>
-        </w:tblPrEx>
         <w:tc>
           <w:tcPr>
             <w:tcW w:w="3000" w:type="dxa"/>
@@ -8362,12 +7947,6 @@
         </w:tc>
       </w:tr>
       <w:tr>
-        <w:tblPrEx>
-          <w:tblCellMar>
-            <w:top w:w="0" w:type="dxa"/>
-            <w:bottom w:w="0" w:type="dxa"/>
-          </w:tblCellMar>
-        </w:tblPrEx>
         <w:tc>
           <w:tcPr>
             <w:tcW w:w="3000" w:type="dxa"/>
@@ -8422,12 +8001,6 @@
         </w:tc>
       </w:tr>
       <w:tr>
-        <w:tblPrEx>
-          <w:tblCellMar>
-            <w:top w:w="0" w:type="dxa"/>
-            <w:bottom w:w="0" w:type="dxa"/>
-          </w:tblCellMar>
-        </w:tblPrEx>
         <w:tc>
           <w:tcPr>
             <w:tcW w:w="3000" w:type="dxa"/>
@@ -8484,12 +8057,6 @@
         </w:tc>
       </w:tr>
       <w:tr>
-        <w:tblPrEx>
-          <w:tblCellMar>
-            <w:top w:w="0" w:type="dxa"/>
-            <w:bottom w:w="0" w:type="dxa"/>
-          </w:tblCellMar>
-        </w:tblPrEx>
         <w:tc>
           <w:tcPr>
             <w:tcW w:w="3000" w:type="dxa"/>
@@ -8606,12 +8173,6 @@
         <w:gridCol w:w="6360"/>
       </w:tblGrid>
       <w:tr>
-        <w:tblPrEx>
-          <w:tblCellMar>
-            <w:top w:w="0" w:type="dxa"/>
-            <w:bottom w:w="0" w:type="dxa"/>
-          </w:tblCellMar>
-        </w:tblPrEx>
         <w:trPr>
           <w:tblHeader/>
         </w:trPr>
@@ -8677,12 +8238,6 @@
         </w:tc>
       </w:tr>
       <w:tr>
-        <w:tblPrEx>
-          <w:tblCellMar>
-            <w:top w:w="0" w:type="dxa"/>
-            <w:bottom w:w="0" w:type="dxa"/>
-          </w:tblCellMar>
-        </w:tblPrEx>
         <w:tc>
           <w:tcPr>
             <w:tcW w:w="3000" w:type="dxa"/>
@@ -8737,12 +8292,6 @@
         </w:tc>
       </w:tr>
       <w:tr>
-        <w:tblPrEx>
-          <w:tblCellMar>
-            <w:top w:w="0" w:type="dxa"/>
-            <w:bottom w:w="0" w:type="dxa"/>
-          </w:tblCellMar>
-        </w:tblPrEx>
         <w:tc>
           <w:tcPr>
             <w:tcW w:w="3000" w:type="dxa"/>
@@ -8799,12 +8348,6 @@
         </w:tc>
       </w:tr>
       <w:tr>
-        <w:tblPrEx>
-          <w:tblCellMar>
-            <w:top w:w="0" w:type="dxa"/>
-            <w:bottom w:w="0" w:type="dxa"/>
-          </w:tblCellMar>
-        </w:tblPrEx>
         <w:tc>
           <w:tcPr>
             <w:tcW w:w="3000" w:type="dxa"/>
@@ -8859,12 +8402,6 @@
         </w:tc>
       </w:tr>
       <w:tr>
-        <w:tblPrEx>
-          <w:tblCellMar>
-            <w:top w:w="0" w:type="dxa"/>
-            <w:bottom w:w="0" w:type="dxa"/>
-          </w:tblCellMar>
-        </w:tblPrEx>
         <w:tc>
           <w:tcPr>
             <w:tcW w:w="3000" w:type="dxa"/>
@@ -8921,12 +8458,6 @@
         </w:tc>
       </w:tr>
       <w:tr>
-        <w:tblPrEx>
-          <w:tblCellMar>
-            <w:top w:w="0" w:type="dxa"/>
-            <w:bottom w:w="0" w:type="dxa"/>
-          </w:tblCellMar>
-        </w:tblPrEx>
         <w:tc>
           <w:tcPr>
             <w:tcW w:w="3000" w:type="dxa"/>
@@ -8982,12 +8513,6 @@
         </w:tc>
       </w:tr>
       <w:tr>
-        <w:tblPrEx>
-          <w:tblCellMar>
-            <w:top w:w="0" w:type="dxa"/>
-            <w:bottom w:w="0" w:type="dxa"/>
-          </w:tblCellMar>
-        </w:tblPrEx>
         <w:tc>
           <w:tcPr>
             <w:tcW w:w="3000" w:type="dxa"/>
@@ -9044,12 +8569,6 @@
         </w:tc>
       </w:tr>
       <w:tr>
-        <w:tblPrEx>
-          <w:tblCellMar>
-            <w:top w:w="0" w:type="dxa"/>
-            <w:bottom w:w="0" w:type="dxa"/>
-          </w:tblCellMar>
-        </w:tblPrEx>
         <w:tc>
           <w:tcPr>
             <w:tcW w:w="3000" w:type="dxa"/>
@@ -9166,12 +8685,6 @@
         <w:gridCol w:w="6360"/>
       </w:tblGrid>
       <w:tr>
-        <w:tblPrEx>
-          <w:tblCellMar>
-            <w:top w:w="0" w:type="dxa"/>
-            <w:bottom w:w="0" w:type="dxa"/>
-          </w:tblCellMar>
-        </w:tblPrEx>
         <w:trPr>
           <w:tblHeader/>
         </w:trPr>
@@ -9237,12 +8750,6 @@
         </w:tc>
       </w:tr>
       <w:tr>
-        <w:tblPrEx>
-          <w:tblCellMar>
-            <w:top w:w="0" w:type="dxa"/>
-            <w:bottom w:w="0" w:type="dxa"/>
-          </w:tblCellMar>
-        </w:tblPrEx>
         <w:tc>
           <w:tcPr>
             <w:tcW w:w="3000" w:type="dxa"/>
@@ -9297,12 +8804,6 @@
         </w:tc>
       </w:tr>
       <w:tr>
-        <w:tblPrEx>
-          <w:tblCellMar>
-            <w:top w:w="0" w:type="dxa"/>
-            <w:bottom w:w="0" w:type="dxa"/>
-          </w:tblCellMar>
-        </w:tblPrEx>
         <w:tc>
           <w:tcPr>
             <w:tcW w:w="3000" w:type="dxa"/>
@@ -9359,12 +8860,6 @@
         </w:tc>
       </w:tr>
       <w:tr>
-        <w:tblPrEx>
-          <w:tblCellMar>
-            <w:top w:w="0" w:type="dxa"/>
-            <w:bottom w:w="0" w:type="dxa"/>
-          </w:tblCellMar>
-        </w:tblPrEx>
         <w:tc>
           <w:tcPr>
             <w:tcW w:w="3000" w:type="dxa"/>
@@ -9419,12 +8914,6 @@
         </w:tc>
       </w:tr>
       <w:tr>
-        <w:tblPrEx>
-          <w:tblCellMar>
-            <w:top w:w="0" w:type="dxa"/>
-            <w:bottom w:w="0" w:type="dxa"/>
-          </w:tblCellMar>
-        </w:tblPrEx>
         <w:tc>
           <w:tcPr>
             <w:tcW w:w="3000" w:type="dxa"/>
@@ -9481,12 +8970,6 @@
         </w:tc>
       </w:tr>
       <w:tr>
-        <w:tblPrEx>
-          <w:tblCellMar>
-            <w:top w:w="0" w:type="dxa"/>
-            <w:bottom w:w="0" w:type="dxa"/>
-          </w:tblCellMar>
-        </w:tblPrEx>
         <w:tc>
           <w:tcPr>
             <w:tcW w:w="3000" w:type="dxa"/>
@@ -9541,12 +9024,6 @@
         </w:tc>
       </w:tr>
       <w:tr>
-        <w:tblPrEx>
-          <w:tblCellMar>
-            <w:top w:w="0" w:type="dxa"/>
-            <w:bottom w:w="0" w:type="dxa"/>
-          </w:tblCellMar>
-        </w:tblPrEx>
         <w:tc>
           <w:tcPr>
             <w:tcW w:w="3000" w:type="dxa"/>
@@ -9603,12 +9080,6 @@
         </w:tc>
       </w:tr>
       <w:tr>
-        <w:tblPrEx>
-          <w:tblCellMar>
-            <w:top w:w="0" w:type="dxa"/>
-            <w:bottom w:w="0" w:type="dxa"/>
-          </w:tblCellMar>
-        </w:tblPrEx>
         <w:tc>
           <w:tcPr>
             <w:tcW w:w="3000" w:type="dxa"/>
@@ -9725,12 +9196,6 @@
         <w:gridCol w:w="6360"/>
       </w:tblGrid>
       <w:tr>
-        <w:tblPrEx>
-          <w:tblCellMar>
-            <w:top w:w="0" w:type="dxa"/>
-            <w:bottom w:w="0" w:type="dxa"/>
-          </w:tblCellMar>
-        </w:tblPrEx>
         <w:trPr>
           <w:tblHeader/>
         </w:trPr>
@@ -9796,12 +9261,6 @@
         </w:tc>
       </w:tr>
       <w:tr>
-        <w:tblPrEx>
-          <w:tblCellMar>
-            <w:top w:w="0" w:type="dxa"/>
-            <w:bottom w:w="0" w:type="dxa"/>
-          </w:tblCellMar>
-        </w:tblPrEx>
         <w:tc>
           <w:tcPr>
             <w:tcW w:w="3000" w:type="dxa"/>
@@ -9856,12 +9315,6 @@
         </w:tc>
       </w:tr>
       <w:tr>
-        <w:tblPrEx>
-          <w:tblCellMar>
-            <w:top w:w="0" w:type="dxa"/>
-            <w:bottom w:w="0" w:type="dxa"/>
-          </w:tblCellMar>
-        </w:tblPrEx>
         <w:tc>
           <w:tcPr>
             <w:tcW w:w="3000" w:type="dxa"/>
@@ -9918,12 +9371,6 @@
         </w:tc>
       </w:tr>
       <w:tr>
-        <w:tblPrEx>
-          <w:tblCellMar>
-            <w:top w:w="0" w:type="dxa"/>
-            <w:bottom w:w="0" w:type="dxa"/>
-          </w:tblCellMar>
-        </w:tblPrEx>
         <w:tc>
           <w:tcPr>
             <w:tcW w:w="3000" w:type="dxa"/>
@@ -9978,12 +9425,6 @@
         </w:tc>
       </w:tr>
       <w:tr>
-        <w:tblPrEx>
-          <w:tblCellMar>
-            <w:top w:w="0" w:type="dxa"/>
-            <w:bottom w:w="0" w:type="dxa"/>
-          </w:tblCellMar>
-        </w:tblPrEx>
         <w:tc>
           <w:tcPr>
             <w:tcW w:w="3000" w:type="dxa"/>
@@ -10040,12 +9481,6 @@
         </w:tc>
       </w:tr>
       <w:tr>
-        <w:tblPrEx>
-          <w:tblCellMar>
-            <w:top w:w="0" w:type="dxa"/>
-            <w:bottom w:w="0" w:type="dxa"/>
-          </w:tblCellMar>
-        </w:tblPrEx>
         <w:tc>
           <w:tcPr>
             <w:tcW w:w="3000" w:type="dxa"/>
@@ -10100,12 +9535,6 @@
         </w:tc>
       </w:tr>
       <w:tr>
-        <w:tblPrEx>
-          <w:tblCellMar>
-            <w:top w:w="0" w:type="dxa"/>
-            <w:bottom w:w="0" w:type="dxa"/>
-          </w:tblCellMar>
-        </w:tblPrEx>
         <w:tc>
           <w:tcPr>
             <w:tcW w:w="3000" w:type="dxa"/>
@@ -10162,12 +9591,6 @@
         </w:tc>
       </w:tr>
       <w:tr>
-        <w:tblPrEx>
-          <w:tblCellMar>
-            <w:top w:w="0" w:type="dxa"/>
-            <w:bottom w:w="0" w:type="dxa"/>
-          </w:tblCellMar>
-        </w:tblPrEx>
         <w:tc>
           <w:tcPr>
             <w:tcW w:w="3000" w:type="dxa"/>
@@ -10285,12 +9708,6 @@
         <w:gridCol w:w="6360"/>
       </w:tblGrid>
       <w:tr>
-        <w:tblPrEx>
-          <w:tblCellMar>
-            <w:top w:w="0" w:type="dxa"/>
-            <w:bottom w:w="0" w:type="dxa"/>
-          </w:tblCellMar>
-        </w:tblPrEx>
         <w:trPr>
           <w:tblHeader/>
         </w:trPr>
@@ -10356,12 +9773,6 @@
         </w:tc>
       </w:tr>
       <w:tr>
-        <w:tblPrEx>
-          <w:tblCellMar>
-            <w:top w:w="0" w:type="dxa"/>
-            <w:bottom w:w="0" w:type="dxa"/>
-          </w:tblCellMar>
-        </w:tblPrEx>
         <w:tc>
           <w:tcPr>
             <w:tcW w:w="3000" w:type="dxa"/>
@@ -10416,12 +9827,6 @@
         </w:tc>
       </w:tr>
       <w:tr>
-        <w:tblPrEx>
-          <w:tblCellMar>
-            <w:top w:w="0" w:type="dxa"/>
-            <w:bottom w:w="0" w:type="dxa"/>
-          </w:tblCellMar>
-        </w:tblPrEx>
         <w:tc>
           <w:tcPr>
             <w:tcW w:w="3000" w:type="dxa"/>
@@ -10478,12 +9883,6 @@
         </w:tc>
       </w:tr>
       <w:tr>
-        <w:tblPrEx>
-          <w:tblCellMar>
-            <w:top w:w="0" w:type="dxa"/>
-            <w:bottom w:w="0" w:type="dxa"/>
-          </w:tblCellMar>
-        </w:tblPrEx>
         <w:tc>
           <w:tcPr>
             <w:tcW w:w="3000" w:type="dxa"/>
@@ -10538,12 +9937,6 @@
         </w:tc>
       </w:tr>
       <w:tr>
-        <w:tblPrEx>
-          <w:tblCellMar>
-            <w:top w:w="0" w:type="dxa"/>
-            <w:bottom w:w="0" w:type="dxa"/>
-          </w:tblCellMar>
-        </w:tblPrEx>
         <w:tc>
           <w:tcPr>
             <w:tcW w:w="3000" w:type="dxa"/>
@@ -10600,12 +9993,6 @@
         </w:tc>
       </w:tr>
       <w:tr>
-        <w:tblPrEx>
-          <w:tblCellMar>
-            <w:top w:w="0" w:type="dxa"/>
-            <w:bottom w:w="0" w:type="dxa"/>
-          </w:tblCellMar>
-        </w:tblPrEx>
         <w:tc>
           <w:tcPr>
             <w:tcW w:w="3000" w:type="dxa"/>
@@ -10660,12 +10047,6 @@
         </w:tc>
       </w:tr>
       <w:tr>
-        <w:tblPrEx>
-          <w:tblCellMar>
-            <w:top w:w="0" w:type="dxa"/>
-            <w:bottom w:w="0" w:type="dxa"/>
-          </w:tblCellMar>
-        </w:tblPrEx>
         <w:tc>
           <w:tcPr>
             <w:tcW w:w="3000" w:type="dxa"/>
@@ -10722,12 +10103,6 @@
         </w:tc>
       </w:tr>
       <w:tr>
-        <w:tblPrEx>
-          <w:tblCellMar>
-            <w:top w:w="0" w:type="dxa"/>
-            <w:bottom w:w="0" w:type="dxa"/>
-          </w:tblCellMar>
-        </w:tblPrEx>
         <w:tc>
           <w:tcPr>
             <w:tcW w:w="3000" w:type="dxa"/>
@@ -10844,12 +10219,6 @@
         <w:gridCol w:w="6360"/>
       </w:tblGrid>
       <w:tr>
-        <w:tblPrEx>
-          <w:tblCellMar>
-            <w:top w:w="0" w:type="dxa"/>
-            <w:bottom w:w="0" w:type="dxa"/>
-          </w:tblCellMar>
-        </w:tblPrEx>
         <w:trPr>
           <w:tblHeader/>
         </w:trPr>
@@ -10915,12 +10284,6 @@
         </w:tc>
       </w:tr>
       <w:tr>
-        <w:tblPrEx>
-          <w:tblCellMar>
-            <w:top w:w="0" w:type="dxa"/>
-            <w:bottom w:w="0" w:type="dxa"/>
-          </w:tblCellMar>
-        </w:tblPrEx>
         <w:tc>
           <w:tcPr>
             <w:tcW w:w="3000" w:type="dxa"/>
@@ -10975,12 +10338,6 @@
         </w:tc>
       </w:tr>
       <w:tr>
-        <w:tblPrEx>
-          <w:tblCellMar>
-            <w:top w:w="0" w:type="dxa"/>
-            <w:bottom w:w="0" w:type="dxa"/>
-          </w:tblCellMar>
-        </w:tblPrEx>
         <w:tc>
           <w:tcPr>
             <w:tcW w:w="3000" w:type="dxa"/>
@@ -11037,12 +10394,6 @@
         </w:tc>
       </w:tr>
       <w:tr>
-        <w:tblPrEx>
-          <w:tblCellMar>
-            <w:top w:w="0" w:type="dxa"/>
-            <w:bottom w:w="0" w:type="dxa"/>
-          </w:tblCellMar>
-        </w:tblPrEx>
         <w:tc>
           <w:tcPr>
             <w:tcW w:w="3000" w:type="dxa"/>
@@ -11097,12 +10448,6 @@
         </w:tc>
       </w:tr>
       <w:tr>
-        <w:tblPrEx>
-          <w:tblCellMar>
-            <w:top w:w="0" w:type="dxa"/>
-            <w:bottom w:w="0" w:type="dxa"/>
-          </w:tblCellMar>
-        </w:tblPrEx>
         <w:tc>
           <w:tcPr>
             <w:tcW w:w="3000" w:type="dxa"/>
@@ -11159,12 +10504,6 @@
         </w:tc>
       </w:tr>
       <w:tr>
-        <w:tblPrEx>
-          <w:tblCellMar>
-            <w:top w:w="0" w:type="dxa"/>
-            <w:bottom w:w="0" w:type="dxa"/>
-          </w:tblCellMar>
-        </w:tblPrEx>
         <w:tc>
           <w:tcPr>
             <w:tcW w:w="3000" w:type="dxa"/>
@@ -11219,12 +10558,6 @@
         </w:tc>
       </w:tr>
       <w:tr>
-        <w:tblPrEx>
-          <w:tblCellMar>
-            <w:top w:w="0" w:type="dxa"/>
-            <w:bottom w:w="0" w:type="dxa"/>
-          </w:tblCellMar>
-        </w:tblPrEx>
         <w:tc>
           <w:tcPr>
             <w:tcW w:w="3000" w:type="dxa"/>
@@ -11281,12 +10614,6 @@
         </w:tc>
       </w:tr>
       <w:tr>
-        <w:tblPrEx>
-          <w:tblCellMar>
-            <w:top w:w="0" w:type="dxa"/>
-            <w:bottom w:w="0" w:type="dxa"/>
-          </w:tblCellMar>
-        </w:tblPrEx>
         <w:tc>
           <w:tcPr>
             <w:tcW w:w="3000" w:type="dxa"/>
@@ -11403,12 +10730,6 @@
         <w:gridCol w:w="6360"/>
       </w:tblGrid>
       <w:tr>
-        <w:tblPrEx>
-          <w:tblCellMar>
-            <w:top w:w="0" w:type="dxa"/>
-            <w:bottom w:w="0" w:type="dxa"/>
-          </w:tblCellMar>
-        </w:tblPrEx>
         <w:trPr>
           <w:tblHeader/>
         </w:trPr>
@@ -11474,12 +10795,6 @@
         </w:tc>
       </w:tr>
       <w:tr>
-        <w:tblPrEx>
-          <w:tblCellMar>
-            <w:top w:w="0" w:type="dxa"/>
-            <w:bottom w:w="0" w:type="dxa"/>
-          </w:tblCellMar>
-        </w:tblPrEx>
         <w:tc>
           <w:tcPr>
             <w:tcW w:w="3000" w:type="dxa"/>
@@ -11534,12 +10849,6 @@
         </w:tc>
       </w:tr>
       <w:tr>
-        <w:tblPrEx>
-          <w:tblCellMar>
-            <w:top w:w="0" w:type="dxa"/>
-            <w:bottom w:w="0" w:type="dxa"/>
-          </w:tblCellMar>
-        </w:tblPrEx>
         <w:tc>
           <w:tcPr>
             <w:tcW w:w="3000" w:type="dxa"/>
@@ -11596,12 +10905,6 @@
         </w:tc>
       </w:tr>
       <w:tr>
-        <w:tblPrEx>
-          <w:tblCellMar>
-            <w:top w:w="0" w:type="dxa"/>
-            <w:bottom w:w="0" w:type="dxa"/>
-          </w:tblCellMar>
-        </w:tblPrEx>
         <w:tc>
           <w:tcPr>
             <w:tcW w:w="3000" w:type="dxa"/>
@@ -11656,12 +10959,6 @@
         </w:tc>
       </w:tr>
       <w:tr>
-        <w:tblPrEx>
-          <w:tblCellMar>
-            <w:top w:w="0" w:type="dxa"/>
-            <w:bottom w:w="0" w:type="dxa"/>
-          </w:tblCellMar>
-        </w:tblPrEx>
         <w:tc>
           <w:tcPr>
             <w:tcW w:w="3000" w:type="dxa"/>
@@ -11718,12 +11015,6 @@
         </w:tc>
       </w:tr>
       <w:tr>
-        <w:tblPrEx>
-          <w:tblCellMar>
-            <w:top w:w="0" w:type="dxa"/>
-            <w:bottom w:w="0" w:type="dxa"/>
-          </w:tblCellMar>
-        </w:tblPrEx>
         <w:tc>
           <w:tcPr>
             <w:tcW w:w="3000" w:type="dxa"/>
@@ -11779,12 +11070,6 @@
         </w:tc>
       </w:tr>
       <w:tr>
-        <w:tblPrEx>
-          <w:tblCellMar>
-            <w:top w:w="0" w:type="dxa"/>
-            <w:bottom w:w="0" w:type="dxa"/>
-          </w:tblCellMar>
-        </w:tblPrEx>
         <w:tc>
           <w:tcPr>
             <w:tcW w:w="3000" w:type="dxa"/>
@@ -11841,12 +11126,6 @@
         </w:tc>
       </w:tr>
       <w:tr>
-        <w:tblPrEx>
-          <w:tblCellMar>
-            <w:top w:w="0" w:type="dxa"/>
-            <w:bottom w:w="0" w:type="dxa"/>
-          </w:tblCellMar>
-        </w:tblPrEx>
         <w:tc>
           <w:tcPr>
             <w:tcW w:w="3000" w:type="dxa"/>
@@ -11963,12 +11242,6 @@
         <w:gridCol w:w="6360"/>
       </w:tblGrid>
       <w:tr>
-        <w:tblPrEx>
-          <w:tblCellMar>
-            <w:top w:w="0" w:type="dxa"/>
-            <w:bottom w:w="0" w:type="dxa"/>
-          </w:tblCellMar>
-        </w:tblPrEx>
         <w:trPr>
           <w:tblHeader/>
         </w:trPr>
@@ -12034,12 +11307,6 @@
         </w:tc>
       </w:tr>
       <w:tr>
-        <w:tblPrEx>
-          <w:tblCellMar>
-            <w:top w:w="0" w:type="dxa"/>
-            <w:bottom w:w="0" w:type="dxa"/>
-          </w:tblCellMar>
-        </w:tblPrEx>
         <w:tc>
           <w:tcPr>
             <w:tcW w:w="3000" w:type="dxa"/>
@@ -12094,12 +11361,6 @@
         </w:tc>
       </w:tr>
       <w:tr>
-        <w:tblPrEx>
-          <w:tblCellMar>
-            <w:top w:w="0" w:type="dxa"/>
-            <w:bottom w:w="0" w:type="dxa"/>
-          </w:tblCellMar>
-        </w:tblPrEx>
         <w:tc>
           <w:tcPr>
             <w:tcW w:w="3000" w:type="dxa"/>
@@ -12156,12 +11417,6 @@
         </w:tc>
       </w:tr>
       <w:tr>
-        <w:tblPrEx>
-          <w:tblCellMar>
-            <w:top w:w="0" w:type="dxa"/>
-            <w:bottom w:w="0" w:type="dxa"/>
-          </w:tblCellMar>
-        </w:tblPrEx>
         <w:tc>
           <w:tcPr>
             <w:tcW w:w="3000" w:type="dxa"/>
@@ -12216,12 +11471,6 @@
         </w:tc>
       </w:tr>
       <w:tr>
-        <w:tblPrEx>
-          <w:tblCellMar>
-            <w:top w:w="0" w:type="dxa"/>
-            <w:bottom w:w="0" w:type="dxa"/>
-          </w:tblCellMar>
-        </w:tblPrEx>
         <w:tc>
           <w:tcPr>
             <w:tcW w:w="3000" w:type="dxa"/>
@@ -12278,12 +11527,6 @@
         </w:tc>
       </w:tr>
       <w:tr>
-        <w:tblPrEx>
-          <w:tblCellMar>
-            <w:top w:w="0" w:type="dxa"/>
-            <w:bottom w:w="0" w:type="dxa"/>
-          </w:tblCellMar>
-        </w:tblPrEx>
         <w:tc>
           <w:tcPr>
             <w:tcW w:w="3000" w:type="dxa"/>
@@ -12338,12 +11581,6 @@
         </w:tc>
       </w:tr>
       <w:tr>
-        <w:tblPrEx>
-          <w:tblCellMar>
-            <w:top w:w="0" w:type="dxa"/>
-            <w:bottom w:w="0" w:type="dxa"/>
-          </w:tblCellMar>
-        </w:tblPrEx>
         <w:tc>
           <w:tcPr>
             <w:tcW w:w="3000" w:type="dxa"/>
@@ -12400,12 +11637,6 @@
         </w:tc>
       </w:tr>
       <w:tr>
-        <w:tblPrEx>
-          <w:tblCellMar>
-            <w:top w:w="0" w:type="dxa"/>
-            <w:bottom w:w="0" w:type="dxa"/>
-          </w:tblCellMar>
-        </w:tblPrEx>
         <w:tc>
           <w:tcPr>
             <w:tcW w:w="3000" w:type="dxa"/>
@@ -12522,12 +11753,6 @@
         <w:gridCol w:w="6360"/>
       </w:tblGrid>
       <w:tr>
-        <w:tblPrEx>
-          <w:tblCellMar>
-            <w:top w:w="0" w:type="dxa"/>
-            <w:bottom w:w="0" w:type="dxa"/>
-          </w:tblCellMar>
-        </w:tblPrEx>
         <w:trPr>
           <w:tblHeader/>
         </w:trPr>
@@ -12593,12 +11818,6 @@
         </w:tc>
       </w:tr>
       <w:tr>
-        <w:tblPrEx>
-          <w:tblCellMar>
-            <w:top w:w="0" w:type="dxa"/>
-            <w:bottom w:w="0" w:type="dxa"/>
-          </w:tblCellMar>
-        </w:tblPrEx>
         <w:tc>
           <w:tcPr>
             <w:tcW w:w="3000" w:type="dxa"/>
@@ -12653,12 +11872,6 @@
         </w:tc>
       </w:tr>
       <w:tr>
-        <w:tblPrEx>
-          <w:tblCellMar>
-            <w:top w:w="0" w:type="dxa"/>
-            <w:bottom w:w="0" w:type="dxa"/>
-          </w:tblCellMar>
-        </w:tblPrEx>
         <w:tc>
           <w:tcPr>
             <w:tcW w:w="3000" w:type="dxa"/>
@@ -12715,12 +11928,6 @@
         </w:tc>
       </w:tr>
       <w:tr>
-        <w:tblPrEx>
-          <w:tblCellMar>
-            <w:top w:w="0" w:type="dxa"/>
-            <w:bottom w:w="0" w:type="dxa"/>
-          </w:tblCellMar>
-        </w:tblPrEx>
         <w:tc>
           <w:tcPr>
             <w:tcW w:w="3000" w:type="dxa"/>
@@ -12775,12 +11982,6 @@
         </w:tc>
       </w:tr>
       <w:tr>
-        <w:tblPrEx>
-          <w:tblCellMar>
-            <w:top w:w="0" w:type="dxa"/>
-            <w:bottom w:w="0" w:type="dxa"/>
-          </w:tblCellMar>
-        </w:tblPrEx>
         <w:tc>
           <w:tcPr>
             <w:tcW w:w="3000" w:type="dxa"/>
@@ -12837,12 +12038,6 @@
         </w:tc>
       </w:tr>
       <w:tr>
-        <w:tblPrEx>
-          <w:tblCellMar>
-            <w:top w:w="0" w:type="dxa"/>
-            <w:bottom w:w="0" w:type="dxa"/>
-          </w:tblCellMar>
-        </w:tblPrEx>
         <w:tc>
           <w:tcPr>
             <w:tcW w:w="3000" w:type="dxa"/>
@@ -12897,12 +12092,6 @@
         </w:tc>
       </w:tr>
       <w:tr>
-        <w:tblPrEx>
-          <w:tblCellMar>
-            <w:top w:w="0" w:type="dxa"/>
-            <w:bottom w:w="0" w:type="dxa"/>
-          </w:tblCellMar>
-        </w:tblPrEx>
         <w:tc>
           <w:tcPr>
             <w:tcW w:w="3000" w:type="dxa"/>
@@ -12959,12 +12148,6 @@
         </w:tc>
       </w:tr>
       <w:tr>
-        <w:tblPrEx>
-          <w:tblCellMar>
-            <w:top w:w="0" w:type="dxa"/>
-            <w:bottom w:w="0" w:type="dxa"/>
-          </w:tblCellMar>
-        </w:tblPrEx>
         <w:tc>
           <w:tcPr>
             <w:tcW w:w="3000" w:type="dxa"/>
@@ -13081,12 +12264,6 @@
         <w:gridCol w:w="6360"/>
       </w:tblGrid>
       <w:tr>
-        <w:tblPrEx>
-          <w:tblCellMar>
-            <w:top w:w="0" w:type="dxa"/>
-            <w:bottom w:w="0" w:type="dxa"/>
-          </w:tblCellMar>
-        </w:tblPrEx>
         <w:trPr>
           <w:tblHeader/>
         </w:trPr>
@@ -13152,12 +12329,6 @@
         </w:tc>
       </w:tr>
       <w:tr>
-        <w:tblPrEx>
-          <w:tblCellMar>
-            <w:top w:w="0" w:type="dxa"/>
-            <w:bottom w:w="0" w:type="dxa"/>
-          </w:tblCellMar>
-        </w:tblPrEx>
         <w:tc>
           <w:tcPr>
             <w:tcW w:w="3000" w:type="dxa"/>
@@ -13212,12 +12383,6 @@
         </w:tc>
       </w:tr>
       <w:tr>
-        <w:tblPrEx>
-          <w:tblCellMar>
-            <w:top w:w="0" w:type="dxa"/>
-            <w:bottom w:w="0" w:type="dxa"/>
-          </w:tblCellMar>
-        </w:tblPrEx>
         <w:tc>
           <w:tcPr>
             <w:tcW w:w="3000" w:type="dxa"/>
@@ -13274,12 +12439,6 @@
         </w:tc>
       </w:tr>
       <w:tr>
-        <w:tblPrEx>
-          <w:tblCellMar>
-            <w:top w:w="0" w:type="dxa"/>
-            <w:bottom w:w="0" w:type="dxa"/>
-          </w:tblCellMar>
-        </w:tblPrEx>
         <w:tc>
           <w:tcPr>
             <w:tcW w:w="3000" w:type="dxa"/>
@@ -13334,12 +12493,6 @@
         </w:tc>
       </w:tr>
       <w:tr>
-        <w:tblPrEx>
-          <w:tblCellMar>
-            <w:top w:w="0" w:type="dxa"/>
-            <w:bottom w:w="0" w:type="dxa"/>
-          </w:tblCellMar>
-        </w:tblPrEx>
         <w:tc>
           <w:tcPr>
             <w:tcW w:w="3000" w:type="dxa"/>
@@ -13396,12 +12549,6 @@
         </w:tc>
       </w:tr>
       <w:tr>
-        <w:tblPrEx>
-          <w:tblCellMar>
-            <w:top w:w="0" w:type="dxa"/>
-            <w:bottom w:w="0" w:type="dxa"/>
-          </w:tblCellMar>
-        </w:tblPrEx>
         <w:tc>
           <w:tcPr>
             <w:tcW w:w="3000" w:type="dxa"/>
@@ -13456,12 +12603,6 @@
         </w:tc>
       </w:tr>
       <w:tr>
-        <w:tblPrEx>
-          <w:tblCellMar>
-            <w:top w:w="0" w:type="dxa"/>
-            <w:bottom w:w="0" w:type="dxa"/>
-          </w:tblCellMar>
-        </w:tblPrEx>
         <w:tc>
           <w:tcPr>
             <w:tcW w:w="3000" w:type="dxa"/>
@@ -13518,12 +12659,6 @@
         </w:tc>
       </w:tr>
       <w:tr>
-        <w:tblPrEx>
-          <w:tblCellMar>
-            <w:top w:w="0" w:type="dxa"/>
-            <w:bottom w:w="0" w:type="dxa"/>
-          </w:tblCellMar>
-        </w:tblPrEx>
         <w:tc>
           <w:tcPr>
             <w:tcW w:w="3000" w:type="dxa"/>
@@ -13640,12 +12775,6 @@
         <w:gridCol w:w="6360"/>
       </w:tblGrid>
       <w:tr>
-        <w:tblPrEx>
-          <w:tblCellMar>
-            <w:top w:w="0" w:type="dxa"/>
-            <w:bottom w:w="0" w:type="dxa"/>
-          </w:tblCellMar>
-        </w:tblPrEx>
         <w:trPr>
           <w:tblHeader/>
         </w:trPr>
@@ -13711,12 +12840,6 @@
         </w:tc>
       </w:tr>
       <w:tr>
-        <w:tblPrEx>
-          <w:tblCellMar>
-            <w:top w:w="0" w:type="dxa"/>
-            <w:bottom w:w="0" w:type="dxa"/>
-          </w:tblCellMar>
-        </w:tblPrEx>
         <w:tc>
           <w:tcPr>
             <w:tcW w:w="3000" w:type="dxa"/>
@@ -13771,12 +12894,6 @@
         </w:tc>
       </w:tr>
       <w:tr>
-        <w:tblPrEx>
-          <w:tblCellMar>
-            <w:top w:w="0" w:type="dxa"/>
-            <w:bottom w:w="0" w:type="dxa"/>
-          </w:tblCellMar>
-        </w:tblPrEx>
         <w:tc>
           <w:tcPr>
             <w:tcW w:w="3000" w:type="dxa"/>
@@ -13833,12 +12950,6 @@
         </w:tc>
       </w:tr>
       <w:tr>
-        <w:tblPrEx>
-          <w:tblCellMar>
-            <w:top w:w="0" w:type="dxa"/>
-            <w:bottom w:w="0" w:type="dxa"/>
-          </w:tblCellMar>
-        </w:tblPrEx>
         <w:tc>
           <w:tcPr>
             <w:tcW w:w="3000" w:type="dxa"/>
@@ -13893,12 +13004,6 @@
         </w:tc>
       </w:tr>
       <w:tr>
-        <w:tblPrEx>
-          <w:tblCellMar>
-            <w:top w:w="0" w:type="dxa"/>
-            <w:bottom w:w="0" w:type="dxa"/>
-          </w:tblCellMar>
-        </w:tblPrEx>
         <w:tc>
           <w:tcPr>
             <w:tcW w:w="3000" w:type="dxa"/>
@@ -13955,12 +13060,6 @@
         </w:tc>
       </w:tr>
       <w:tr>
-        <w:tblPrEx>
-          <w:tblCellMar>
-            <w:top w:w="0" w:type="dxa"/>
-            <w:bottom w:w="0" w:type="dxa"/>
-          </w:tblCellMar>
-        </w:tblPrEx>
         <w:tc>
           <w:tcPr>
             <w:tcW w:w="3000" w:type="dxa"/>
@@ -14015,12 +13114,6 @@
         </w:tc>
       </w:tr>
       <w:tr>
-        <w:tblPrEx>
-          <w:tblCellMar>
-            <w:top w:w="0" w:type="dxa"/>
-            <w:bottom w:w="0" w:type="dxa"/>
-          </w:tblCellMar>
-        </w:tblPrEx>
         <w:tc>
           <w:tcPr>
             <w:tcW w:w="3000" w:type="dxa"/>
@@ -14077,12 +13170,6 @@
         </w:tc>
       </w:tr>
       <w:tr>
-        <w:tblPrEx>
-          <w:tblCellMar>
-            <w:top w:w="0" w:type="dxa"/>
-            <w:bottom w:w="0" w:type="dxa"/>
-          </w:tblCellMar>
-        </w:tblPrEx>
         <w:tc>
           <w:tcPr>
             <w:tcW w:w="3000" w:type="dxa"/>
@@ -14299,12 +13386,6 @@
         <w:gridCol w:w="7360"/>
       </w:tblGrid>
       <w:tr>
-        <w:tblPrEx>
-          <w:tblCellMar>
-            <w:top w:w="0" w:type="dxa"/>
-            <w:bottom w:w="0" w:type="dxa"/>
-          </w:tblCellMar>
-        </w:tblPrEx>
         <w:trPr>
           <w:tblHeader/>
         </w:trPr>
@@ -14370,12 +13451,6 @@
         </w:tc>
       </w:tr>
       <w:tr>
-        <w:tblPrEx>
-          <w:tblCellMar>
-            <w:top w:w="0" w:type="dxa"/>
-            <w:bottom w:w="0" w:type="dxa"/>
-          </w:tblCellMar>
-        </w:tblPrEx>
         <w:tc>
           <w:tcPr>
             <w:tcW w:w="2000" w:type="dxa"/>
@@ -14430,12 +13505,6 @@
         </w:tc>
       </w:tr>
       <w:tr>
-        <w:tblPrEx>
-          <w:tblCellMar>
-            <w:top w:w="0" w:type="dxa"/>
-            <w:bottom w:w="0" w:type="dxa"/>
-          </w:tblCellMar>
-        </w:tblPrEx>
         <w:tc>
           <w:tcPr>
             <w:tcW w:w="2000" w:type="dxa"/>
@@ -14492,12 +13561,6 @@
         </w:tc>
       </w:tr>
       <w:tr>
-        <w:tblPrEx>
-          <w:tblCellMar>
-            <w:top w:w="0" w:type="dxa"/>
-            <w:bottom w:w="0" w:type="dxa"/>
-          </w:tblCellMar>
-        </w:tblPrEx>
         <w:tc>
           <w:tcPr>
             <w:tcW w:w="2000" w:type="dxa"/>
@@ -14552,12 +13615,6 @@
         </w:tc>
       </w:tr>
       <w:tr>
-        <w:tblPrEx>
-          <w:tblCellMar>
-            <w:top w:w="0" w:type="dxa"/>
-            <w:bottom w:w="0" w:type="dxa"/>
-          </w:tblCellMar>
-        </w:tblPrEx>
         <w:tc>
           <w:tcPr>
             <w:tcW w:w="2000" w:type="dxa"/>
@@ -14614,12 +13671,6 @@
         </w:tc>
       </w:tr>
       <w:tr>
-        <w:tblPrEx>
-          <w:tblCellMar>
-            <w:top w:w="0" w:type="dxa"/>
-            <w:bottom w:w="0" w:type="dxa"/>
-          </w:tblCellMar>
-        </w:tblPrEx>
         <w:tc>
           <w:tcPr>
             <w:tcW w:w="2000" w:type="dxa"/>
@@ -14812,12 +13863,6 @@
         <w:gridCol w:w="7360"/>
       </w:tblGrid>
       <w:tr>
-        <w:tblPrEx>
-          <w:tblCellMar>
-            <w:top w:w="0" w:type="dxa"/>
-            <w:bottom w:w="0" w:type="dxa"/>
-          </w:tblCellMar>
-        </w:tblPrEx>
         <w:trPr>
           <w:tblHeader/>
         </w:trPr>
@@ -14883,12 +13928,6 @@
         </w:tc>
       </w:tr>
       <w:tr>
-        <w:tblPrEx>
-          <w:tblCellMar>
-            <w:top w:w="0" w:type="dxa"/>
-            <w:bottom w:w="0" w:type="dxa"/>
-          </w:tblCellMar>
-        </w:tblPrEx>
         <w:tc>
           <w:tcPr>
             <w:tcW w:w="2000" w:type="dxa"/>
@@ -14943,12 +13982,6 @@
         </w:tc>
       </w:tr>
       <w:tr>
-        <w:tblPrEx>
-          <w:tblCellMar>
-            <w:top w:w="0" w:type="dxa"/>
-            <w:bottom w:w="0" w:type="dxa"/>
-          </w:tblCellMar>
-        </w:tblPrEx>
         <w:tc>
           <w:tcPr>
             <w:tcW w:w="2000" w:type="dxa"/>
@@ -15068,12 +14101,6 @@
         <w:gridCol w:w="7360"/>
       </w:tblGrid>
       <w:tr>
-        <w:tblPrEx>
-          <w:tblCellMar>
-            <w:top w:w="0" w:type="dxa"/>
-            <w:bottom w:w="0" w:type="dxa"/>
-          </w:tblCellMar>
-        </w:tblPrEx>
         <w:trPr>
           <w:tblHeader/>
         </w:trPr>
@@ -15139,12 +14166,6 @@
         </w:tc>
       </w:tr>
       <w:tr>
-        <w:tblPrEx>
-          <w:tblCellMar>
-            <w:top w:w="0" w:type="dxa"/>
-            <w:bottom w:w="0" w:type="dxa"/>
-          </w:tblCellMar>
-        </w:tblPrEx>
         <w:tc>
           <w:tcPr>
             <w:tcW w:w="2000" w:type="dxa"/>
@@ -15199,12 +14220,6 @@
         </w:tc>
       </w:tr>
       <w:tr>
-        <w:tblPrEx>
-          <w:tblCellMar>
-            <w:top w:w="0" w:type="dxa"/>
-            <w:bottom w:w="0" w:type="dxa"/>
-          </w:tblCellMar>
-        </w:tblPrEx>
         <w:tc>
           <w:tcPr>
             <w:tcW w:w="2000" w:type="dxa"/>
@@ -15369,12 +14384,6 @@
         <w:gridCol w:w="7760"/>
       </w:tblGrid>
       <w:tr>
-        <w:tblPrEx>
-          <w:tblCellMar>
-            <w:top w:w="0" w:type="dxa"/>
-            <w:bottom w:w="0" w:type="dxa"/>
-          </w:tblCellMar>
-        </w:tblPrEx>
         <w:trPr>
           <w:tblHeader/>
         </w:trPr>
@@ -15440,12 +14449,6 @@
         </w:tc>
       </w:tr>
       <w:tr>
-        <w:tblPrEx>
-          <w:tblCellMar>
-            <w:top w:w="0" w:type="dxa"/>
-            <w:bottom w:w="0" w:type="dxa"/>
-          </w:tblCellMar>
-        </w:tblPrEx>
         <w:tc>
           <w:tcPr>
             <w:tcW w:w="1600" w:type="dxa"/>
@@ -15500,12 +14503,6 @@
         </w:tc>
       </w:tr>
       <w:tr>
-        <w:tblPrEx>
-          <w:tblCellMar>
-            <w:top w:w="0" w:type="dxa"/>
-            <w:bottom w:w="0" w:type="dxa"/>
-          </w:tblCellMar>
-        </w:tblPrEx>
         <w:tc>
           <w:tcPr>
             <w:tcW w:w="1600" w:type="dxa"/>
@@ -15562,12 +14559,6 @@
         </w:tc>
       </w:tr>
       <w:tr>
-        <w:tblPrEx>
-          <w:tblCellMar>
-            <w:top w:w="0" w:type="dxa"/>
-            <w:bottom w:w="0" w:type="dxa"/>
-          </w:tblCellMar>
-        </w:tblPrEx>
         <w:tc>
           <w:tcPr>
             <w:tcW w:w="1600" w:type="dxa"/>
@@ -15622,12 +14613,6 @@
         </w:tc>
       </w:tr>
       <w:tr>
-        <w:tblPrEx>
-          <w:tblCellMar>
-            <w:top w:w="0" w:type="dxa"/>
-            <w:bottom w:w="0" w:type="dxa"/>
-          </w:tblCellMar>
-        </w:tblPrEx>
         <w:tc>
           <w:tcPr>
             <w:tcW w:w="1600" w:type="dxa"/>
@@ -15684,12 +14669,6 @@
         </w:tc>
       </w:tr>
       <w:tr>
-        <w:tblPrEx>
-          <w:tblCellMar>
-            <w:top w:w="0" w:type="dxa"/>
-            <w:bottom w:w="0" w:type="dxa"/>
-          </w:tblCellMar>
-        </w:tblPrEx>
         <w:tc>
           <w:tcPr>
             <w:tcW w:w="1600" w:type="dxa"/>
@@ -15744,12 +14723,6 @@
         </w:tc>
       </w:tr>
       <w:tr>
-        <w:tblPrEx>
-          <w:tblCellMar>
-            <w:top w:w="0" w:type="dxa"/>
-            <w:bottom w:w="0" w:type="dxa"/>
-          </w:tblCellMar>
-        </w:tblPrEx>
         <w:tc>
           <w:tcPr>
             <w:tcW w:w="1600" w:type="dxa"/>
@@ -16400,12 +15373,6 @@
         <w:gridCol w:w="830"/>
       </w:tblGrid>
       <w:tr>
-        <w:tblPrEx>
-          <w:tblCellMar>
-            <w:top w:w="0" w:type="dxa"/>
-            <w:bottom w:w="0" w:type="dxa"/>
-          </w:tblCellMar>
-        </w:tblPrEx>
         <w:trPr>
           <w:tblHeader/>
         </w:trPr>
@@ -16591,12 +15558,6 @@
         </w:tc>
       </w:tr>
       <w:tr>
-        <w:tblPrEx>
-          <w:tblCellMar>
-            <w:top w:w="0" w:type="dxa"/>
-            <w:bottom w:w="0" w:type="dxa"/>
-          </w:tblCellMar>
-        </w:tblPrEx>
         <w:tc>
           <w:tcPr>
             <w:tcW w:w="500" w:type="dxa"/>
@@ -16750,12 +15711,6 @@
         </w:tc>
       </w:tr>
       <w:tr>
-        <w:tblPrEx>
-          <w:tblCellMar>
-            <w:top w:w="0" w:type="dxa"/>
-            <w:bottom w:w="0" w:type="dxa"/>
-          </w:tblCellMar>
-        </w:tblPrEx>
         <w:tc>
           <w:tcPr>
             <w:tcW w:w="500" w:type="dxa"/>
@@ -16909,12 +15864,6 @@
         </w:tc>
       </w:tr>
       <w:tr>
-        <w:tblPrEx>
-          <w:tblCellMar>
-            <w:top w:w="0" w:type="dxa"/>
-            <w:bottom w:w="0" w:type="dxa"/>
-          </w:tblCellMar>
-        </w:tblPrEx>
         <w:tc>
           <w:tcPr>
             <w:tcW w:w="500" w:type="dxa"/>
@@ -17068,12 +16017,6 @@
         </w:tc>
       </w:tr>
       <w:tr>
-        <w:tblPrEx>
-          <w:tblCellMar>
-            <w:top w:w="0" w:type="dxa"/>
-            <w:bottom w:w="0" w:type="dxa"/>
-          </w:tblCellMar>
-        </w:tblPrEx>
         <w:tc>
           <w:tcPr>
             <w:tcW w:w="500" w:type="dxa"/>
@@ -17227,12 +16170,6 @@
         </w:tc>
       </w:tr>
       <w:tr>
-        <w:tblPrEx>
-          <w:tblCellMar>
-            <w:top w:w="0" w:type="dxa"/>
-            <w:bottom w:w="0" w:type="dxa"/>
-          </w:tblCellMar>
-        </w:tblPrEx>
         <w:tc>
           <w:tcPr>
             <w:tcW w:w="500" w:type="dxa"/>
@@ -17447,12 +16384,6 @@
         <w:gridCol w:w="7760"/>
       </w:tblGrid>
       <w:tr>
-        <w:tblPrEx>
-          <w:tblCellMar>
-            <w:top w:w="0" w:type="dxa"/>
-            <w:bottom w:w="0" w:type="dxa"/>
-          </w:tblCellMar>
-        </w:tblPrEx>
         <w:trPr>
           <w:tblHeader/>
         </w:trPr>
@@ -17518,12 +16449,6 @@
         </w:tc>
       </w:tr>
       <w:tr>
-        <w:tblPrEx>
-          <w:tblCellMar>
-            <w:top w:w="0" w:type="dxa"/>
-            <w:bottom w:w="0" w:type="dxa"/>
-          </w:tblCellMar>
-        </w:tblPrEx>
         <w:tc>
           <w:tcPr>
             <w:tcW w:w="1600" w:type="dxa"/>
@@ -17578,12 +16503,6 @@
         </w:tc>
       </w:tr>
       <w:tr>
-        <w:tblPrEx>
-          <w:tblCellMar>
-            <w:top w:w="0" w:type="dxa"/>
-            <w:bottom w:w="0" w:type="dxa"/>
-          </w:tblCellMar>
-        </w:tblPrEx>
         <w:tc>
           <w:tcPr>
             <w:tcW w:w="1600" w:type="dxa"/>
@@ -17640,12 +16559,6 @@
         </w:tc>
       </w:tr>
       <w:tr>
-        <w:tblPrEx>
-          <w:tblCellMar>
-            <w:top w:w="0" w:type="dxa"/>
-            <w:bottom w:w="0" w:type="dxa"/>
-          </w:tblCellMar>
-        </w:tblPrEx>
         <w:tc>
           <w:tcPr>
             <w:tcW w:w="1600" w:type="dxa"/>
@@ -17700,12 +16613,6 @@
         </w:tc>
       </w:tr>
       <w:tr>
-        <w:tblPrEx>
-          <w:tblCellMar>
-            <w:top w:w="0" w:type="dxa"/>
-            <w:bottom w:w="0" w:type="dxa"/>
-          </w:tblCellMar>
-        </w:tblPrEx>
         <w:tc>
           <w:tcPr>
             <w:tcW w:w="1600" w:type="dxa"/>
@@ -17867,12 +16774,6 @@
         <w:gridCol w:w="830"/>
       </w:tblGrid>
       <w:tr>
-        <w:tblPrEx>
-          <w:tblCellMar>
-            <w:top w:w="0" w:type="dxa"/>
-            <w:bottom w:w="0" w:type="dxa"/>
-          </w:tblCellMar>
-        </w:tblPrEx>
         <w:trPr>
           <w:tblHeader/>
         </w:trPr>
@@ -18058,12 +16959,6 @@
         </w:tc>
       </w:tr>
       <w:tr>
-        <w:tblPrEx>
-          <w:tblCellMar>
-            <w:top w:w="0" w:type="dxa"/>
-            <w:bottom w:w="0" w:type="dxa"/>
-          </w:tblCellMar>
-        </w:tblPrEx>
         <w:tc>
           <w:tcPr>
             <w:tcW w:w="500" w:type="dxa"/>
@@ -18217,12 +17112,6 @@
         </w:tc>
       </w:tr>
       <w:tr>
-        <w:tblPrEx>
-          <w:tblCellMar>
-            <w:top w:w="0" w:type="dxa"/>
-            <w:bottom w:w="0" w:type="dxa"/>
-          </w:tblCellMar>
-        </w:tblPrEx>
         <w:tc>
           <w:tcPr>
             <w:tcW w:w="500" w:type="dxa"/>
@@ -18376,12 +17265,6 @@
         </w:tc>
       </w:tr>
       <w:tr>
-        <w:tblPrEx>
-          <w:tblCellMar>
-            <w:top w:w="0" w:type="dxa"/>
-            <w:bottom w:w="0" w:type="dxa"/>
-          </w:tblCellMar>
-        </w:tblPrEx>
         <w:tc>
           <w:tcPr>
             <w:tcW w:w="500" w:type="dxa"/>
@@ -18535,12 +17418,6 @@
         </w:tc>
       </w:tr>
       <w:tr>
-        <w:tblPrEx>
-          <w:tblCellMar>
-            <w:top w:w="0" w:type="dxa"/>
-            <w:bottom w:w="0" w:type="dxa"/>
-          </w:tblCellMar>
-        </w:tblPrEx>
         <w:tc>
           <w:tcPr>
             <w:tcW w:w="500" w:type="dxa"/>
@@ -18694,12 +17571,6 @@
         </w:tc>
       </w:tr>
       <w:tr>
-        <w:tblPrEx>
-          <w:tblCellMar>
-            <w:top w:w="0" w:type="dxa"/>
-            <w:bottom w:w="0" w:type="dxa"/>
-          </w:tblCellMar>
-        </w:tblPrEx>
         <w:tc>
           <w:tcPr>
             <w:tcW w:w="500" w:type="dxa"/>
@@ -18854,12 +17725,6 @@
         </w:tc>
       </w:tr>
       <w:tr>
-        <w:tblPrEx>
-          <w:tblCellMar>
-            <w:top w:w="0" w:type="dxa"/>
-            <w:bottom w:w="0" w:type="dxa"/>
-          </w:tblCellMar>
-        </w:tblPrEx>
         <w:tc>
           <w:tcPr>
             <w:tcW w:w="500" w:type="dxa"/>
@@ -19169,12 +18034,6 @@
         <w:gridCol w:w="830"/>
       </w:tblGrid>
       <w:tr>
-        <w:tblPrEx>
-          <w:tblCellMar>
-            <w:top w:w="0" w:type="dxa"/>
-            <w:bottom w:w="0" w:type="dxa"/>
-          </w:tblCellMar>
-        </w:tblPrEx>
         <w:trPr>
           <w:tblHeader/>
         </w:trPr>
@@ -19360,12 +18219,6 @@
         </w:tc>
       </w:tr>
       <w:tr>
-        <w:tblPrEx>
-          <w:tblCellMar>
-            <w:top w:w="0" w:type="dxa"/>
-            <w:bottom w:w="0" w:type="dxa"/>
-          </w:tblCellMar>
-        </w:tblPrEx>
         <w:tc>
           <w:tcPr>
             <w:tcW w:w="500" w:type="dxa"/>
@@ -19519,12 +18372,6 @@
         </w:tc>
       </w:tr>
       <w:tr>
-        <w:tblPrEx>
-          <w:tblCellMar>
-            <w:top w:w="0" w:type="dxa"/>
-            <w:bottom w:w="0" w:type="dxa"/>
-          </w:tblCellMar>
-        </w:tblPrEx>
         <w:tc>
           <w:tcPr>
             <w:tcW w:w="500" w:type="dxa"/>
@@ -19678,12 +18525,6 @@
         </w:tc>
       </w:tr>
       <w:tr>
-        <w:tblPrEx>
-          <w:tblCellMar>
-            <w:top w:w="0" w:type="dxa"/>
-            <w:bottom w:w="0" w:type="dxa"/>
-          </w:tblCellMar>
-        </w:tblPrEx>
         <w:tc>
           <w:tcPr>
             <w:tcW w:w="500" w:type="dxa"/>
@@ -19837,12 +18678,6 @@
         </w:tc>
       </w:tr>
       <w:tr>
-        <w:tblPrEx>
-          <w:tblCellMar>
-            <w:top w:w="0" w:type="dxa"/>
-            <w:bottom w:w="0" w:type="dxa"/>
-          </w:tblCellMar>
-        </w:tblPrEx>
         <w:tc>
           <w:tcPr>
             <w:tcW w:w="500" w:type="dxa"/>
@@ -19996,12 +18831,6 @@
         </w:tc>
       </w:tr>
       <w:tr>
-        <w:tblPrEx>
-          <w:tblCellMar>
-            <w:top w:w="0" w:type="dxa"/>
-            <w:bottom w:w="0" w:type="dxa"/>
-          </w:tblCellMar>
-        </w:tblPrEx>
         <w:tc>
           <w:tcPr>
             <w:tcW w:w="500" w:type="dxa"/>
@@ -20155,12 +18984,6 @@
         </w:tc>
       </w:tr>
       <w:tr>
-        <w:tblPrEx>
-          <w:tblCellMar>
-            <w:top w:w="0" w:type="dxa"/>
-            <w:bottom w:w="0" w:type="dxa"/>
-          </w:tblCellMar>
-        </w:tblPrEx>
         <w:tc>
           <w:tcPr>
             <w:tcW w:w="500" w:type="dxa"/>
@@ -20314,12 +19137,6 @@
         </w:tc>
       </w:tr>
       <w:tr>
-        <w:tblPrEx>
-          <w:tblCellMar>
-            <w:top w:w="0" w:type="dxa"/>
-            <w:bottom w:w="0" w:type="dxa"/>
-          </w:tblCellMar>
-        </w:tblPrEx>
         <w:tc>
           <w:tcPr>
             <w:tcW w:w="500" w:type="dxa"/>
@@ -20542,12 +19359,6 @@
         <w:gridCol w:w="7760"/>
       </w:tblGrid>
       <w:tr>
-        <w:tblPrEx>
-          <w:tblCellMar>
-            <w:top w:w="0" w:type="dxa"/>
-            <w:bottom w:w="0" w:type="dxa"/>
-          </w:tblCellMar>
-        </w:tblPrEx>
         <w:trPr>
           <w:tblHeader/>
         </w:trPr>
@@ -20613,12 +19424,6 @@
         </w:tc>
       </w:tr>
       <w:tr>
-        <w:tblPrEx>
-          <w:tblCellMar>
-            <w:top w:w="0" w:type="dxa"/>
-            <w:bottom w:w="0" w:type="dxa"/>
-          </w:tblCellMar>
-        </w:tblPrEx>
         <w:tc>
           <w:tcPr>
             <w:tcW w:w="1600" w:type="dxa"/>
@@ -20673,12 +19478,6 @@
         </w:tc>
       </w:tr>
       <w:tr>
-        <w:tblPrEx>
-          <w:tblCellMar>
-            <w:top w:w="0" w:type="dxa"/>
-            <w:bottom w:w="0" w:type="dxa"/>
-          </w:tblCellMar>
-        </w:tblPrEx>
         <w:tc>
           <w:tcPr>
             <w:tcW w:w="1600" w:type="dxa"/>
@@ -20735,12 +19534,6 @@
         </w:tc>
       </w:tr>
       <w:tr>
-        <w:tblPrEx>
-          <w:tblCellMar>
-            <w:top w:w="0" w:type="dxa"/>
-            <w:bottom w:w="0" w:type="dxa"/>
-          </w:tblCellMar>
-        </w:tblPrEx>
         <w:tc>
           <w:tcPr>
             <w:tcW w:w="1600" w:type="dxa"/>
@@ -20795,12 +19588,6 @@
         </w:tc>
       </w:tr>
       <w:tr>
-        <w:tblPrEx>
-          <w:tblCellMar>
-            <w:top w:w="0" w:type="dxa"/>
-            <w:bottom w:w="0" w:type="dxa"/>
-          </w:tblCellMar>
-        </w:tblPrEx>
         <w:tc>
           <w:tcPr>
             <w:tcW w:w="1600" w:type="dxa"/>
@@ -20857,12 +19644,6 @@
         </w:tc>
       </w:tr>
       <w:tr>
-        <w:tblPrEx>
-          <w:tblCellMar>
-            <w:top w:w="0" w:type="dxa"/>
-            <w:bottom w:w="0" w:type="dxa"/>
-          </w:tblCellMar>
-        </w:tblPrEx>
         <w:tc>
           <w:tcPr>
             <w:tcW w:w="1600" w:type="dxa"/>
@@ -20961,12 +19742,6 @@
         <w:gridCol w:w="830"/>
       </w:tblGrid>
       <w:tr>
-        <w:tblPrEx>
-          <w:tblCellMar>
-            <w:top w:w="0" w:type="dxa"/>
-            <w:bottom w:w="0" w:type="dxa"/>
-          </w:tblCellMar>
-        </w:tblPrEx>
         <w:trPr>
           <w:tblHeader/>
         </w:trPr>
@@ -21152,12 +19927,6 @@
         </w:tc>
       </w:tr>
       <w:tr>
-        <w:tblPrEx>
-          <w:tblCellMar>
-            <w:top w:w="0" w:type="dxa"/>
-            <w:bottom w:w="0" w:type="dxa"/>
-          </w:tblCellMar>
-        </w:tblPrEx>
         <w:tc>
           <w:tcPr>
             <w:tcW w:w="500" w:type="dxa"/>
@@ -21311,12 +20080,6 @@
         </w:tc>
       </w:tr>
       <w:tr>
-        <w:tblPrEx>
-          <w:tblCellMar>
-            <w:top w:w="0" w:type="dxa"/>
-            <w:bottom w:w="0" w:type="dxa"/>
-          </w:tblCellMar>
-        </w:tblPrEx>
         <w:tc>
           <w:tcPr>
             <w:tcW w:w="500" w:type="dxa"/>
@@ -21470,12 +20233,6 @@
         </w:tc>
       </w:tr>
       <w:tr>
-        <w:tblPrEx>
-          <w:tblCellMar>
-            <w:top w:w="0" w:type="dxa"/>
-            <w:bottom w:w="0" w:type="dxa"/>
-          </w:tblCellMar>
-        </w:tblPrEx>
         <w:tc>
           <w:tcPr>
             <w:tcW w:w="500" w:type="dxa"/>
@@ -21629,12 +20386,6 @@
         </w:tc>
       </w:tr>
       <w:tr>
-        <w:tblPrEx>
-          <w:tblCellMar>
-            <w:top w:w="0" w:type="dxa"/>
-            <w:bottom w:w="0" w:type="dxa"/>
-          </w:tblCellMar>
-        </w:tblPrEx>
         <w:tc>
           <w:tcPr>
             <w:tcW w:w="500" w:type="dxa"/>
@@ -21788,12 +20539,6 @@
         </w:tc>
       </w:tr>
       <w:tr>
-        <w:tblPrEx>
-          <w:tblCellMar>
-            <w:top w:w="0" w:type="dxa"/>
-            <w:bottom w:w="0" w:type="dxa"/>
-          </w:tblCellMar>
-        </w:tblPrEx>
         <w:tc>
           <w:tcPr>
             <w:tcW w:w="500" w:type="dxa"/>
@@ -21947,12 +20692,6 @@
         </w:tc>
       </w:tr>
       <w:tr>
-        <w:tblPrEx>
-          <w:tblCellMar>
-            <w:top w:w="0" w:type="dxa"/>
-            <w:bottom w:w="0" w:type="dxa"/>
-          </w:tblCellMar>
-        </w:tblPrEx>
         <w:tc>
           <w:tcPr>
             <w:tcW w:w="500" w:type="dxa"/>
@@ -22154,12 +20893,6 @@
         <w:gridCol w:w="7560"/>
       </w:tblGrid>
       <w:tr>
-        <w:tblPrEx>
-          <w:tblCellMar>
-            <w:top w:w="0" w:type="dxa"/>
-            <w:bottom w:w="0" w:type="dxa"/>
-          </w:tblCellMar>
-        </w:tblPrEx>
         <w:trPr>
           <w:tblHeader/>
         </w:trPr>
@@ -22225,12 +20958,6 @@
         </w:tc>
       </w:tr>
       <w:tr>
-        <w:tblPrEx>
-          <w:tblCellMar>
-            <w:top w:w="0" w:type="dxa"/>
-            <w:bottom w:w="0" w:type="dxa"/>
-          </w:tblCellMar>
-        </w:tblPrEx>
         <w:tc>
           <w:tcPr>
             <w:tcW w:w="1800" w:type="dxa"/>
@@ -22285,12 +21012,6 @@
         </w:tc>
       </w:tr>
       <w:tr>
-        <w:tblPrEx>
-          <w:tblCellMar>
-            <w:top w:w="0" w:type="dxa"/>
-            <w:bottom w:w="0" w:type="dxa"/>
-          </w:tblCellMar>
-        </w:tblPrEx>
         <w:tc>
           <w:tcPr>
             <w:tcW w:w="1800" w:type="dxa"/>
@@ -22347,12 +21068,6 @@
         </w:tc>
       </w:tr>
       <w:tr>
-        <w:tblPrEx>
-          <w:tblCellMar>
-            <w:top w:w="0" w:type="dxa"/>
-            <w:bottom w:w="0" w:type="dxa"/>
-          </w:tblCellMar>
-        </w:tblPrEx>
         <w:tc>
           <w:tcPr>
             <w:tcW w:w="1800" w:type="dxa"/>
@@ -22407,12 +21122,6 @@
         </w:tc>
       </w:tr>
       <w:tr>
-        <w:tblPrEx>
-          <w:tblCellMar>
-            <w:top w:w="0" w:type="dxa"/>
-            <w:bottom w:w="0" w:type="dxa"/>
-          </w:tblCellMar>
-        </w:tblPrEx>
         <w:tc>
           <w:tcPr>
             <w:tcW w:w="1800" w:type="dxa"/>
@@ -22469,12 +21178,6 @@
         </w:tc>
       </w:tr>
       <w:tr>
-        <w:tblPrEx>
-          <w:tblCellMar>
-            <w:top w:w="0" w:type="dxa"/>
-            <w:bottom w:w="0" w:type="dxa"/>
-          </w:tblCellMar>
-        </w:tblPrEx>
         <w:tc>
           <w:tcPr>
             <w:tcW w:w="1800" w:type="dxa"/>
@@ -22529,12 +21232,6 @@
         </w:tc>
       </w:tr>
       <w:tr>
-        <w:tblPrEx>
-          <w:tblCellMar>
-            <w:top w:w="0" w:type="dxa"/>
-            <w:bottom w:w="0" w:type="dxa"/>
-          </w:tblCellMar>
-        </w:tblPrEx>
         <w:tc>
           <w:tcPr>
             <w:tcW w:w="1800" w:type="dxa"/>
@@ -22591,12 +21288,6 @@
         </w:tc>
       </w:tr>
       <w:tr>
-        <w:tblPrEx>
-          <w:tblCellMar>
-            <w:top w:w="0" w:type="dxa"/>
-            <w:bottom w:w="0" w:type="dxa"/>
-          </w:tblCellMar>
-        </w:tblPrEx>
         <w:tc>
           <w:tcPr>
             <w:tcW w:w="1800" w:type="dxa"/>
@@ -22651,12 +21342,6 @@
         </w:tc>
       </w:tr>
       <w:tr>
-        <w:tblPrEx>
-          <w:tblCellMar>
-            <w:top w:w="0" w:type="dxa"/>
-            <w:bottom w:w="0" w:type="dxa"/>
-          </w:tblCellMar>
-        </w:tblPrEx>
         <w:tc>
           <w:tcPr>
             <w:tcW w:w="1800" w:type="dxa"/>
@@ -22713,12 +21398,6 @@
         </w:tc>
       </w:tr>
       <w:tr>
-        <w:tblPrEx>
-          <w:tblCellMar>
-            <w:top w:w="0" w:type="dxa"/>
-            <w:bottom w:w="0" w:type="dxa"/>
-          </w:tblCellMar>
-        </w:tblPrEx>
         <w:tc>
           <w:tcPr>
             <w:tcW w:w="1800" w:type="dxa"/>
@@ -22773,12 +21452,6 @@
         </w:tc>
       </w:tr>
       <w:tr>
-        <w:tblPrEx>
-          <w:tblCellMar>
-            <w:top w:w="0" w:type="dxa"/>
-            <w:bottom w:w="0" w:type="dxa"/>
-          </w:tblCellMar>
-        </w:tblPrEx>
         <w:tc>
           <w:tcPr>
             <w:tcW w:w="1800" w:type="dxa"/>
@@ -23015,12 +21688,6 @@
         <w:gridCol w:w="7360"/>
       </w:tblGrid>
       <w:tr>
-        <w:tblPrEx>
-          <w:tblCellMar>
-            <w:top w:w="0" w:type="dxa"/>
-            <w:bottom w:w="0" w:type="dxa"/>
-          </w:tblCellMar>
-        </w:tblPrEx>
         <w:trPr>
           <w:tblHeader/>
         </w:trPr>
@@ -23086,12 +21753,6 @@
         </w:tc>
       </w:tr>
       <w:tr>
-        <w:tblPrEx>
-          <w:tblCellMar>
-            <w:top w:w="0" w:type="dxa"/>
-            <w:bottom w:w="0" w:type="dxa"/>
-          </w:tblCellMar>
-        </w:tblPrEx>
         <w:tc>
           <w:tcPr>
             <w:tcW w:w="2000" w:type="dxa"/>
@@ -23146,12 +21807,6 @@
         </w:tc>
       </w:tr>
       <w:tr>
-        <w:tblPrEx>
-          <w:tblCellMar>
-            <w:top w:w="0" w:type="dxa"/>
-            <w:bottom w:w="0" w:type="dxa"/>
-          </w:tblCellMar>
-        </w:tblPrEx>
         <w:tc>
           <w:tcPr>
             <w:tcW w:w="2000" w:type="dxa"/>
@@ -23208,12 +21863,6 @@
         </w:tc>
       </w:tr>
       <w:tr>
-        <w:tblPrEx>
-          <w:tblCellMar>
-            <w:top w:w="0" w:type="dxa"/>
-            <w:bottom w:w="0" w:type="dxa"/>
-          </w:tblCellMar>
-        </w:tblPrEx>
         <w:tc>
           <w:tcPr>
             <w:tcW w:w="2000" w:type="dxa"/>
@@ -23268,12 +21917,6 @@
         </w:tc>
       </w:tr>
       <w:tr>
-        <w:tblPrEx>
-          <w:tblCellMar>
-            <w:top w:w="0" w:type="dxa"/>
-            <w:bottom w:w="0" w:type="dxa"/>
-          </w:tblCellMar>
-        </w:tblPrEx>
         <w:tc>
           <w:tcPr>
             <w:tcW w:w="2000" w:type="dxa"/>
@@ -23330,12 +21973,6 @@
         </w:tc>
       </w:tr>
       <w:tr>
-        <w:tblPrEx>
-          <w:tblCellMar>
-            <w:top w:w="0" w:type="dxa"/>
-            <w:bottom w:w="0" w:type="dxa"/>
-          </w:tblCellMar>
-        </w:tblPrEx>
         <w:tc>
           <w:tcPr>
             <w:tcW w:w="2000" w:type="dxa"/>
@@ -23390,12 +22027,6 @@
         </w:tc>
       </w:tr>
       <w:tr>
-        <w:tblPrEx>
-          <w:tblCellMar>
-            <w:top w:w="0" w:type="dxa"/>
-            <w:bottom w:w="0" w:type="dxa"/>
-          </w:tblCellMar>
-        </w:tblPrEx>
         <w:tc>
           <w:tcPr>
             <w:tcW w:w="2000" w:type="dxa"/>
@@ -23452,12 +22083,6 @@
         </w:tc>
       </w:tr>
       <w:tr>
-        <w:tblPrEx>
-          <w:tblCellMar>
-            <w:top w:w="0" w:type="dxa"/>
-            <w:bottom w:w="0" w:type="dxa"/>
-          </w:tblCellMar>
-        </w:tblPrEx>
         <w:tc>
           <w:tcPr>
             <w:tcW w:w="2000" w:type="dxa"/>
@@ -23606,12 +22231,6 @@
         <w:gridCol w:w="7360"/>
       </w:tblGrid>
       <w:tr>
-        <w:tblPrEx>
-          <w:tblCellMar>
-            <w:top w:w="0" w:type="dxa"/>
-            <w:bottom w:w="0" w:type="dxa"/>
-          </w:tblCellMar>
-        </w:tblPrEx>
         <w:trPr>
           <w:tblHeader/>
         </w:trPr>
@@ -23677,12 +22296,6 @@
         </w:tc>
       </w:tr>
       <w:tr>
-        <w:tblPrEx>
-          <w:tblCellMar>
-            <w:top w:w="0" w:type="dxa"/>
-            <w:bottom w:w="0" w:type="dxa"/>
-          </w:tblCellMar>
-        </w:tblPrEx>
         <w:tc>
           <w:tcPr>
             <w:tcW w:w="2000" w:type="dxa"/>
@@ -23737,12 +22350,6 @@
         </w:tc>
       </w:tr>
       <w:tr>
-        <w:tblPrEx>
-          <w:tblCellMar>
-            <w:top w:w="0" w:type="dxa"/>
-            <w:bottom w:w="0" w:type="dxa"/>
-          </w:tblCellMar>
-        </w:tblPrEx>
         <w:tc>
           <w:tcPr>
             <w:tcW w:w="2000" w:type="dxa"/>
@@ -23799,12 +22406,6 @@
         </w:tc>
       </w:tr>
       <w:tr>
-        <w:tblPrEx>
-          <w:tblCellMar>
-            <w:top w:w="0" w:type="dxa"/>
-            <w:bottom w:w="0" w:type="dxa"/>
-          </w:tblCellMar>
-        </w:tblPrEx>
         <w:tc>
           <w:tcPr>
             <w:tcW w:w="2000" w:type="dxa"/>
@@ -23859,12 +22460,6 @@
         </w:tc>
       </w:tr>
       <w:tr>
-        <w:tblPrEx>
-          <w:tblCellMar>
-            <w:top w:w="0" w:type="dxa"/>
-            <w:bottom w:w="0" w:type="dxa"/>
-          </w:tblCellMar>
-        </w:tblPrEx>
         <w:tc>
           <w:tcPr>
             <w:tcW w:w="2000" w:type="dxa"/>
@@ -23921,12 +22516,6 @@
         </w:tc>
       </w:tr>
       <w:tr>
-        <w:tblPrEx>
-          <w:tblCellMar>
-            <w:top w:w="0" w:type="dxa"/>
-            <w:bottom w:w="0" w:type="dxa"/>
-          </w:tblCellMar>
-        </w:tblPrEx>
         <w:tc>
           <w:tcPr>
             <w:tcW w:w="2000" w:type="dxa"/>
@@ -23981,12 +22570,6 @@
         </w:tc>
       </w:tr>
       <w:tr>
-        <w:tblPrEx>
-          <w:tblCellMar>
-            <w:top w:w="0" w:type="dxa"/>
-            <w:bottom w:w="0" w:type="dxa"/>
-          </w:tblCellMar>
-        </w:tblPrEx>
         <w:tc>
           <w:tcPr>
             <w:tcW w:w="2000" w:type="dxa"/>
@@ -24226,12 +22809,6 @@
         <w:gridCol w:w="5944"/>
       </w:tblGrid>
       <w:tr>
-        <w:tblPrEx>
-          <w:tblCellMar>
-            <w:top w:w="0" w:type="dxa"/>
-            <w:bottom w:w="0" w:type="dxa"/>
-          </w:tblCellMar>
-        </w:tblPrEx>
         <w:trPr>
           <w:tblHeader/>
         </w:trPr>
@@ -24327,12 +22904,6 @@
         </w:tc>
       </w:tr>
       <w:tr>
-        <w:tblPrEx>
-          <w:tblCellMar>
-            <w:top w:w="0" w:type="dxa"/>
-            <w:bottom w:w="0" w:type="dxa"/>
-          </w:tblCellMar>
-        </w:tblPrEx>
         <w:tc>
           <w:tcPr>
             <w:tcW w:w="900" w:type="dxa"/>
@@ -24407,50 +22978,12 @@
                 <w:sz w:val="20"/>
                 <w:szCs w:val="20"/>
               </w:rPr>
-              <w:t xml:space="preserve">Reports n, mean, sample </w:t>
-            </w:r>
-            <w:proofErr w:type="spellStart"/>
-            <w:r>
-              <w:rPr>
-                <w:sz w:val="20"/>
-                <w:szCs w:val="20"/>
-              </w:rPr>
-              <w:t>Sx</w:t>
-            </w:r>
-            <w:proofErr w:type="spellEnd"/>
-            <w:r>
-              <w:rPr>
-                <w:sz w:val="20"/>
-                <w:szCs w:val="20"/>
-              </w:rPr>
-              <w:t xml:space="preserve">, population </w:t>
-            </w:r>
-            <w:proofErr w:type="spellStart"/>
-            <w:r>
-              <w:rPr>
-                <w:sz w:val="20"/>
-                <w:szCs w:val="20"/>
-              </w:rPr>
-              <w:t>σx</w:t>
-            </w:r>
-            <w:proofErr w:type="spellEnd"/>
-            <w:r>
-              <w:rPr>
-                <w:sz w:val="20"/>
-                <w:szCs w:val="20"/>
-              </w:rPr>
-              <w:t>, ΣX, ΣX²</w:t>
+              <w:t>Reports n, mean, sample Sx, population σx, ΣX, ΣX²</w:t>
             </w:r>
           </w:p>
         </w:tc>
       </w:tr>
       <w:tr>
-        <w:tblPrEx>
-          <w:tblCellMar>
-            <w:top w:w="0" w:type="dxa"/>
-            <w:bottom w:w="0" w:type="dxa"/>
-          </w:tblCellMar>
-        </w:tblPrEx>
         <w:tc>
           <w:tcPr>
             <w:tcW w:w="900" w:type="dxa"/>
@@ -24501,17 +23034,8 @@
                 <w:sz w:val="20"/>
                 <w:szCs w:val="20"/>
               </w:rPr>
-              <w:t xml:space="preserve">Y = a + </w:t>
-            </w:r>
-            <w:proofErr w:type="spellStart"/>
-            <w:r>
-              <w:rPr>
-                <w:sz w:val="20"/>
-                <w:szCs w:val="20"/>
-              </w:rPr>
-              <w:t>bX</w:t>
-            </w:r>
-            <w:proofErr w:type="spellEnd"/>
+              <w:t>Y = a + bX</w:t>
+            </w:r>
           </w:p>
         </w:tc>
         <w:tc>
@@ -24543,12 +23067,6 @@
         </w:tc>
       </w:tr>
       <w:tr>
-        <w:tblPrEx>
-          <w:tblCellMar>
-            <w:top w:w="0" w:type="dxa"/>
-            <w:bottom w:w="0" w:type="dxa"/>
-          </w:tblCellMar>
-        </w:tblPrEx>
         <w:tc>
           <w:tcPr>
             <w:tcW w:w="900" w:type="dxa"/>
@@ -24597,23 +23115,7 @@
                 <w:sz w:val="20"/>
                 <w:szCs w:val="20"/>
               </w:rPr>
-              <w:t xml:space="preserve">Y = a + </w:t>
-            </w:r>
-            <w:proofErr w:type="spellStart"/>
-            <w:r>
-              <w:rPr>
-                <w:sz w:val="20"/>
-                <w:szCs w:val="20"/>
-              </w:rPr>
-              <w:t>b·ln</w:t>
-            </w:r>
-            <w:proofErr w:type="spellEnd"/>
-            <w:r>
-              <w:rPr>
-                <w:sz w:val="20"/>
-                <w:szCs w:val="20"/>
-              </w:rPr>
-              <w:t>(X)</w:t>
+              <w:t>Y = a + b·ln(X)</w:t>
             </w:r>
           </w:p>
         </w:tc>
@@ -24645,12 +23147,6 @@
         </w:tc>
       </w:tr>
       <w:tr>
-        <w:tblPrEx>
-          <w:tblCellMar>
-            <w:top w:w="0" w:type="dxa"/>
-            <w:bottom w:w="0" w:type="dxa"/>
-          </w:tblCellMar>
-        </w:tblPrEx>
         <w:tc>
           <w:tcPr>
             <w:tcW w:w="900" w:type="dxa"/>
@@ -24701,17 +23197,8 @@
                 <w:sz w:val="20"/>
                 <w:szCs w:val="20"/>
               </w:rPr>
-              <w:t xml:space="preserve">Y = </w:t>
-            </w:r>
-            <w:proofErr w:type="spellStart"/>
-            <w:r>
-              <w:rPr>
-                <w:sz w:val="20"/>
-                <w:szCs w:val="20"/>
-              </w:rPr>
-              <w:t>a·bˣ</w:t>
-            </w:r>
-            <w:proofErr w:type="spellEnd"/>
+              <w:t>Y = a·bˣ</w:t>
+            </w:r>
           </w:p>
         </w:tc>
         <w:tc>
@@ -24743,12 +23230,6 @@
         </w:tc>
       </w:tr>
       <w:tr>
-        <w:tblPrEx>
-          <w:tblCellMar>
-            <w:top w:w="0" w:type="dxa"/>
-            <w:bottom w:w="0" w:type="dxa"/>
-          </w:tblCellMar>
-        </w:tblPrEx>
         <w:tc>
           <w:tcPr>
             <w:tcW w:w="900" w:type="dxa"/>
@@ -24797,23 +23278,7 @@
                 <w:sz w:val="20"/>
                 <w:szCs w:val="20"/>
               </w:rPr>
-              <w:t xml:space="preserve">Y = </w:t>
-            </w:r>
-            <w:proofErr w:type="spellStart"/>
-            <w:r>
-              <w:rPr>
-                <w:sz w:val="20"/>
-                <w:szCs w:val="20"/>
-              </w:rPr>
-              <w:t>a·X</w:t>
-            </w:r>
-            <w:proofErr w:type="spellEnd"/>
-            <w:r>
-              <w:rPr>
-                <w:sz w:val="20"/>
-                <w:szCs w:val="20"/>
-              </w:rPr>
-              <w:t>ᵇ</w:t>
+              <w:t>Y = a·Xᵇ</w:t>
             </w:r>
           </w:p>
         </w:tc>
@@ -25010,13 +23475,8 @@
         </w:rPr>
         <w:t xml:space="preserve">Expected: </w:t>
       </w:r>
-      <w:proofErr w:type="spellStart"/>
-      <w:r>
-        <w:t>Sx</w:t>
-      </w:r>
-      <w:proofErr w:type="spellEnd"/>
-      <w:r>
-        <w:t xml:space="preserve"> = √10 ≈ 3.162278   Tolerance ± 0.0001</w:t>
+      <w:r>
+        <w:t>Sx = √10 ≈ 3.162278   Tolerance ± 0.0001</w:t>
       </w:r>
     </w:p>
     <w:p/>
@@ -25324,12 +23784,6 @@
         <w:gridCol w:w="4560"/>
       </w:tblGrid>
       <w:tr>
-        <w:tblPrEx>
-          <w:tblCellMar>
-            <w:top w:w="0" w:type="dxa"/>
-            <w:bottom w:w="0" w:type="dxa"/>
-          </w:tblCellMar>
-        </w:tblPrEx>
         <w:trPr>
           <w:tblHeader/>
         </w:trPr>
@@ -25425,12 +23879,6 @@
         </w:tc>
       </w:tr>
       <w:tr>
-        <w:tblPrEx>
-          <w:tblCellMar>
-            <w:top w:w="0" w:type="dxa"/>
-            <w:bottom w:w="0" w:type="dxa"/>
-          </w:tblCellMar>
-        </w:tblPrEx>
         <w:tc>
           <w:tcPr>
             <w:tcW w:w="1400" w:type="dxa"/>
@@ -25511,12 +23959,6 @@
         </w:tc>
       </w:tr>
       <w:tr>
-        <w:tblPrEx>
-          <w:tblCellMar>
-            <w:top w:w="0" w:type="dxa"/>
-            <w:bottom w:w="0" w:type="dxa"/>
-          </w:tblCellMar>
-        </w:tblPrEx>
         <w:tc>
           <w:tcPr>
             <w:tcW w:w="1400" w:type="dxa"/>
@@ -25600,12 +24042,6 @@
         </w:tc>
       </w:tr>
       <w:tr>
-        <w:tblPrEx>
-          <w:tblCellMar>
-            <w:top w:w="0" w:type="dxa"/>
-            <w:bottom w:w="0" w:type="dxa"/>
-          </w:tblCellMar>
-        </w:tblPrEx>
         <w:tc>
           <w:tcPr>
             <w:tcW w:w="1400" w:type="dxa"/>
@@ -25686,12 +24122,6 @@
         </w:tc>
       </w:tr>
       <w:tr>
-        <w:tblPrEx>
-          <w:tblCellMar>
-            <w:top w:w="0" w:type="dxa"/>
-            <w:bottom w:w="0" w:type="dxa"/>
-          </w:tblCellMar>
-        </w:tblPrEx>
         <w:tc>
           <w:tcPr>
             <w:tcW w:w="1400" w:type="dxa"/>
@@ -25903,12 +24333,6 @@
         <w:gridCol w:w="830"/>
       </w:tblGrid>
       <w:tr>
-        <w:tblPrEx>
-          <w:tblCellMar>
-            <w:top w:w="0" w:type="dxa"/>
-            <w:bottom w:w="0" w:type="dxa"/>
-          </w:tblCellMar>
-        </w:tblPrEx>
         <w:trPr>
           <w:tblHeader/>
         </w:trPr>
@@ -26094,12 +24518,6 @@
         </w:tc>
       </w:tr>
       <w:tr>
-        <w:tblPrEx>
-          <w:tblCellMar>
-            <w:top w:w="0" w:type="dxa"/>
-            <w:bottom w:w="0" w:type="dxa"/>
-          </w:tblCellMar>
-        </w:tblPrEx>
         <w:tc>
           <w:tcPr>
             <w:tcW w:w="500" w:type="dxa"/>
@@ -26253,12 +24671,6 @@
         </w:tc>
       </w:tr>
       <w:tr>
-        <w:tblPrEx>
-          <w:tblCellMar>
-            <w:top w:w="0" w:type="dxa"/>
-            <w:bottom w:w="0" w:type="dxa"/>
-          </w:tblCellMar>
-        </w:tblPrEx>
         <w:tc>
           <w:tcPr>
             <w:tcW w:w="500" w:type="dxa"/>
@@ -26412,12 +24824,6 @@
         </w:tc>
       </w:tr>
       <w:tr>
-        <w:tblPrEx>
-          <w:tblCellMar>
-            <w:top w:w="0" w:type="dxa"/>
-            <w:bottom w:w="0" w:type="dxa"/>
-          </w:tblCellMar>
-        </w:tblPrEx>
         <w:tc>
           <w:tcPr>
             <w:tcW w:w="500" w:type="dxa"/>
@@ -26571,12 +24977,6 @@
         </w:tc>
       </w:tr>
       <w:tr>
-        <w:tblPrEx>
-          <w:tblCellMar>
-            <w:top w:w="0" w:type="dxa"/>
-            <w:bottom w:w="0" w:type="dxa"/>
-          </w:tblCellMar>
-        </w:tblPrEx>
         <w:tc>
           <w:tcPr>
             <w:tcW w:w="500" w:type="dxa"/>
@@ -26785,12 +25185,6 @@
         <w:gridCol w:w="3360"/>
       </w:tblGrid>
       <w:tr>
-        <w:tblPrEx>
-          <w:tblCellMar>
-            <w:top w:w="0" w:type="dxa"/>
-            <w:bottom w:w="0" w:type="dxa"/>
-          </w:tblCellMar>
-        </w:tblPrEx>
         <w:trPr>
           <w:tblHeader/>
         </w:trPr>
@@ -26886,12 +25280,6 @@
         </w:tc>
       </w:tr>
       <w:tr>
-        <w:tblPrEx>
-          <w:tblCellMar>
-            <w:top w:w="0" w:type="dxa"/>
-            <w:bottom w:w="0" w:type="dxa"/>
-          </w:tblCellMar>
-        </w:tblPrEx>
         <w:tc>
           <w:tcPr>
             <w:tcW w:w="1300" w:type="dxa"/>
@@ -26972,12 +25360,6 @@
         </w:tc>
       </w:tr>
       <w:tr>
-        <w:tblPrEx>
-          <w:tblCellMar>
-            <w:top w:w="0" w:type="dxa"/>
-            <w:bottom w:w="0" w:type="dxa"/>
-          </w:tblCellMar>
-        </w:tblPrEx>
         <w:tc>
           <w:tcPr>
             <w:tcW w:w="1300" w:type="dxa"/>
@@ -27061,12 +25443,6 @@
         </w:tc>
       </w:tr>
       <w:tr>
-        <w:tblPrEx>
-          <w:tblCellMar>
-            <w:top w:w="0" w:type="dxa"/>
-            <w:bottom w:w="0" w:type="dxa"/>
-          </w:tblCellMar>
-        </w:tblPrEx>
         <w:tc>
           <w:tcPr>
             <w:tcW w:w="1300" w:type="dxa"/>
@@ -27147,12 +25523,6 @@
         </w:tc>
       </w:tr>
       <w:tr>
-        <w:tblPrEx>
-          <w:tblCellMar>
-            <w:top w:w="0" w:type="dxa"/>
-            <w:bottom w:w="0" w:type="dxa"/>
-          </w:tblCellMar>
-        </w:tblPrEx>
         <w:tc>
           <w:tcPr>
             <w:tcW w:w="1300" w:type="dxa"/>
@@ -27236,12 +25606,6 @@
         </w:tc>
       </w:tr>
       <w:tr>
-        <w:tblPrEx>
-          <w:tblCellMar>
-            <w:top w:w="0" w:type="dxa"/>
-            <w:bottom w:w="0" w:type="dxa"/>
-          </w:tblCellMar>
-        </w:tblPrEx>
         <w:tc>
           <w:tcPr>
             <w:tcW w:w="1300" w:type="dxa"/>
@@ -27322,12 +25686,6 @@
         </w:tc>
       </w:tr>
       <w:tr>
-        <w:tblPrEx>
-          <w:tblCellMar>
-            <w:top w:w="0" w:type="dxa"/>
-            <w:bottom w:w="0" w:type="dxa"/>
-          </w:tblCellMar>
-        </w:tblPrEx>
         <w:tc>
           <w:tcPr>
             <w:tcW w:w="1300" w:type="dxa"/>
@@ -27373,21 +25731,12 @@
             </w:tcMar>
           </w:tcPr>
           <w:p>
-            <w:proofErr w:type="spellStart"/>
-            <w:r>
-              <w:rPr>
-                <w:sz w:val="20"/>
-                <w:szCs w:val="20"/>
-              </w:rPr>
-              <w:t>Semiannual</w:t>
-            </w:r>
-            <w:proofErr w:type="spellEnd"/>
-            <w:r>
-              <w:rPr>
-                <w:sz w:val="20"/>
-                <w:szCs w:val="20"/>
-              </w:rPr>
-              <w:t xml:space="preserve"> (2/Y) or Annual (1/Y) coupon payments</w:t>
+            <w:r>
+              <w:rPr>
+                <w:sz w:val="20"/>
+                <w:szCs w:val="20"/>
+              </w:rPr>
+              <w:t>Semiannual (2/Y) or Annual (1/Y) coupon payments</w:t>
             </w:r>
           </w:p>
         </w:tc>
@@ -27420,12 +25769,6 @@
         </w:tc>
       </w:tr>
       <w:tr>
-        <w:tblPrEx>
-          <w:tblCellMar>
-            <w:top w:w="0" w:type="dxa"/>
-            <w:bottom w:w="0" w:type="dxa"/>
-          </w:tblCellMar>
-        </w:tblPrEx>
         <w:tc>
           <w:tcPr>
             <w:tcW w:w="1300" w:type="dxa"/>
@@ -27506,12 +25849,6 @@
         </w:tc>
       </w:tr>
       <w:tr>
-        <w:tblPrEx>
-          <w:tblCellMar>
-            <w:top w:w="0" w:type="dxa"/>
-            <w:bottom w:w="0" w:type="dxa"/>
-          </w:tblCellMar>
-        </w:tblPrEx>
         <w:tc>
           <w:tcPr>
             <w:tcW w:w="1300" w:type="dxa"/>
@@ -27595,12 +25932,6 @@
         </w:tc>
       </w:tr>
       <w:tr>
-        <w:tblPrEx>
-          <w:tblCellMar>
-            <w:top w:w="0" w:type="dxa"/>
-            <w:bottom w:w="0" w:type="dxa"/>
-          </w:tblCellMar>
-        </w:tblPrEx>
         <w:tc>
           <w:tcPr>
             <w:tcW w:w="1300" w:type="dxa"/>
@@ -27765,15 +26096,7 @@
         <w:spacing w:before="40" w:after="40"/>
       </w:pPr>
       <w:r>
-        <w:t>Select the Coupon Frequency (</w:t>
-      </w:r>
-      <w:proofErr w:type="spellStart"/>
-      <w:r>
-        <w:t>Semiannual</w:t>
-      </w:r>
-      <w:proofErr w:type="spellEnd"/>
-      <w:r>
-        <w:t xml:space="preserve"> or Annual).</w:t>
+        <w:t>Select the Coupon Frequency (Semiannual or Annual).</w:t>
       </w:r>
     </w:p>
     <w:p>
@@ -27847,15 +26170,7 @@
         <w:spacing w:after="120"/>
       </w:pPr>
       <w:r>
-        <w:t>Settlement: 2006-06-12. Redemption: 2007-12-31. CPN=7%. RV=100. Method=30/360. Frequency=</w:t>
-      </w:r>
-      <w:proofErr w:type="spellStart"/>
-      <w:r>
-        <w:t>Semiannual</w:t>
-      </w:r>
-      <w:proofErr w:type="spellEnd"/>
-      <w:r>
-        <w:t>.</w:t>
+        <w:t>Settlement: 2006-06-12. Redemption: 2007-12-31. CPN=7%. RV=100. Method=30/360. Frequency=Semiannual.</w:t>
       </w:r>
     </w:p>
     <w:p>
@@ -27895,15 +26210,7 @@
         <w:spacing w:after="120"/>
       </w:pPr>
       <w:r>
-        <w:t>Settlement: 2024-01-01. Redemption: 2029-01-01. CPN=5%. YLD=5%. RV=100. Method=ACT. Frequency=</w:t>
-      </w:r>
-      <w:proofErr w:type="spellStart"/>
-      <w:r>
-        <w:t>Semiannual</w:t>
-      </w:r>
-      <w:proofErr w:type="spellEnd"/>
-      <w:r>
-        <w:t>.</w:t>
+        <w:t>Settlement: 2024-01-01. Redemption: 2029-01-01. CPN=5%. YLD=5%. RV=100. Method=ACT. Frequency=Semiannual.</w:t>
       </w:r>
     </w:p>
     <w:p>
@@ -27943,15 +26250,7 @@
         <w:spacing w:after="120"/>
       </w:pPr>
       <w:r>
-        <w:t>Settlement: 2024-01-01. Redemption: 2029-01-01. CPN=8%. YLD=5%. RV=100. Method=ACT. Frequency=</w:t>
-      </w:r>
-      <w:proofErr w:type="spellStart"/>
-      <w:r>
-        <w:t>Semiannual</w:t>
-      </w:r>
-      <w:proofErr w:type="spellEnd"/>
-      <w:r>
-        <w:t>.</w:t>
+        <w:t>Settlement: 2024-01-01. Redemption: 2029-01-01. CPN=8%. YLD=5%. RV=100. Method=ACT. Frequency=Semiannual.</w:t>
       </w:r>
     </w:p>
     <w:p>
@@ -27991,15 +26290,7 @@
         <w:spacing w:after="120"/>
       </w:pPr>
       <w:r>
-        <w:t>Settlement: 2024-01-01. Redemption: 2029-01-01. CPN=3%. YLD=6%. RV=100. Method=ACT. Frequency=</w:t>
-      </w:r>
-      <w:proofErr w:type="spellStart"/>
-      <w:r>
-        <w:t>Semiannual</w:t>
-      </w:r>
-      <w:proofErr w:type="spellEnd"/>
-      <w:r>
-        <w:t>.</w:t>
+        <w:t>Settlement: 2024-01-01. Redemption: 2029-01-01. CPN=3%. YLD=6%. RV=100. Method=ACT. Frequency=Semiannual.</w:t>
       </w:r>
     </w:p>
     <w:p>
@@ -28114,12 +26405,6 @@
         <w:gridCol w:w="830"/>
       </w:tblGrid>
       <w:tr>
-        <w:tblPrEx>
-          <w:tblCellMar>
-            <w:top w:w="0" w:type="dxa"/>
-            <w:bottom w:w="0" w:type="dxa"/>
-          </w:tblCellMar>
-        </w:tblPrEx>
         <w:trPr>
           <w:tblHeader/>
         </w:trPr>
@@ -28305,12 +26590,6 @@
         </w:tc>
       </w:tr>
       <w:tr>
-        <w:tblPrEx>
-          <w:tblCellMar>
-            <w:top w:w="0" w:type="dxa"/>
-            <w:bottom w:w="0" w:type="dxa"/>
-          </w:tblCellMar>
-        </w:tblPrEx>
         <w:tc>
           <w:tcPr>
             <w:tcW w:w="500" w:type="dxa"/>
@@ -28464,12 +26743,6 @@
         </w:tc>
       </w:tr>
       <w:tr>
-        <w:tblPrEx>
-          <w:tblCellMar>
-            <w:top w:w="0" w:type="dxa"/>
-            <w:bottom w:w="0" w:type="dxa"/>
-          </w:tblCellMar>
-        </w:tblPrEx>
         <w:tc>
           <w:tcPr>
             <w:tcW w:w="500" w:type="dxa"/>
@@ -28623,12 +26896,6 @@
         </w:tc>
       </w:tr>
       <w:tr>
-        <w:tblPrEx>
-          <w:tblCellMar>
-            <w:top w:w="0" w:type="dxa"/>
-            <w:bottom w:w="0" w:type="dxa"/>
-          </w:tblCellMar>
-        </w:tblPrEx>
         <w:tc>
           <w:tcPr>
             <w:tcW w:w="500" w:type="dxa"/>
@@ -28782,12 +27049,6 @@
         </w:tc>
       </w:tr>
       <w:tr>
-        <w:tblPrEx>
-          <w:tblCellMar>
-            <w:top w:w="0" w:type="dxa"/>
-            <w:bottom w:w="0" w:type="dxa"/>
-          </w:tblCellMar>
-        </w:tblPrEx>
         <w:tc>
           <w:tcPr>
             <w:tcW w:w="500" w:type="dxa"/>
@@ -28941,12 +27202,6 @@
         </w:tc>
       </w:tr>
       <w:tr>
-        <w:tblPrEx>
-          <w:tblCellMar>
-            <w:top w:w="0" w:type="dxa"/>
-            <w:bottom w:w="0" w:type="dxa"/>
-          </w:tblCellMar>
-        </w:tblPrEx>
         <w:tc>
           <w:tcPr>
             <w:tcW w:w="500" w:type="dxa"/>
@@ -29042,7 +27297,6 @@
             </w:tcMar>
           </w:tcPr>
           <w:p>
-            <w:proofErr w:type="spellStart"/>
             <w:r>
               <w:rPr>
                 <w:b/>
@@ -29051,9 +27305,151 @@
                 <w:sz w:val="20"/>
                 <w:szCs w:val="20"/>
               </w:rPr>
-              <w:t>ValueError</w:t>
-            </w:r>
-            <w:proofErr w:type="spellEnd"/>
+              <w:t>ValueError raised</w:t>
+            </w:r>
+          </w:p>
+        </w:tc>
+        <w:tc>
+          <w:tcPr>
+            <w:tcW w:w="960" w:type="dxa"/>
+            <w:tcBorders>
+              <w:top w:val="single" w:sz="1" w:space="0" w:color="CCCCCC"/>
+              <w:left w:val="single" w:sz="1" w:space="0" w:color="CCCCCC"/>
+              <w:bottom w:val="single" w:sz="1" w:space="0" w:color="CCCCCC"/>
+              <w:right w:val="single" w:sz="1" w:space="0" w:color="CCCCCC"/>
+            </w:tcBorders>
+            <w:tcMar>
+              <w:top w:w="80" w:type="dxa"/>
+              <w:left w:w="120" w:type="dxa"/>
+              <w:bottom w:w="80" w:type="dxa"/>
+              <w:right w:w="120" w:type="dxa"/>
+            </w:tcMar>
+          </w:tcPr>
+          <w:p>
+            <w:r>
+              <w:rPr>
+                <w:sz w:val="20"/>
+                <w:szCs w:val="20"/>
+              </w:rPr>
+              <w:t>Must error</w:t>
+            </w:r>
+          </w:p>
+        </w:tc>
+        <w:tc>
+          <w:tcPr>
+            <w:tcW w:w="500" w:type="dxa"/>
+            <w:tcBorders>
+              <w:top w:val="single" w:sz="1" w:space="0" w:color="CCCCCC"/>
+              <w:left w:val="single" w:sz="1" w:space="0" w:color="CCCCCC"/>
+              <w:bottom w:val="single" w:sz="1" w:space="0" w:color="CCCCCC"/>
+              <w:right w:val="single" w:sz="1" w:space="0" w:color="CCCCCC"/>
+            </w:tcBorders>
+            <w:tcMar>
+              <w:top w:w="80" w:type="dxa"/>
+              <w:left w:w="120" w:type="dxa"/>
+              <w:bottom w:w="80" w:type="dxa"/>
+              <w:right w:w="120" w:type="dxa"/>
+            </w:tcMar>
+          </w:tcPr>
+          <w:p/>
+        </w:tc>
+      </w:tr>
+      <w:tr>
+        <w:tc>
+          <w:tcPr>
+            <w:tcW w:w="500" w:type="dxa"/>
+            <w:tcBorders>
+              <w:top w:val="single" w:sz="1" w:space="0" w:color="CCCCCC"/>
+              <w:left w:val="single" w:sz="1" w:space="0" w:color="CCCCCC"/>
+              <w:bottom w:val="single" w:sz="1" w:space="0" w:color="CCCCCC"/>
+              <w:right w:val="single" w:sz="1" w:space="0" w:color="CCCCCC"/>
+            </w:tcBorders>
+            <w:tcMar>
+              <w:top w:w="80" w:type="dxa"/>
+              <w:left w:w="120" w:type="dxa"/>
+              <w:bottom w:w="80" w:type="dxa"/>
+              <w:right w:w="120" w:type="dxa"/>
+            </w:tcMar>
+          </w:tcPr>
+          <w:p>
+            <w:r>
+              <w:rPr>
+                <w:sz w:val="20"/>
+                <w:szCs w:val="20"/>
+              </w:rPr>
+              <w:t>3.06</w:t>
+            </w:r>
+          </w:p>
+        </w:tc>
+        <w:tc>
+          <w:tcPr>
+            <w:tcW w:w="2500" w:type="dxa"/>
+            <w:tcBorders>
+              <w:top w:val="single" w:sz="1" w:space="0" w:color="CCCCCC"/>
+              <w:left w:val="single" w:sz="1" w:space="0" w:color="CCCCCC"/>
+              <w:bottom w:val="single" w:sz="1" w:space="0" w:color="CCCCCC"/>
+              <w:right w:val="single" w:sz="1" w:space="0" w:color="CCCCCC"/>
+            </w:tcBorders>
+            <w:tcMar>
+              <w:top w:w="80" w:type="dxa"/>
+              <w:left w:w="120" w:type="dxa"/>
+              <w:bottom w:w="80" w:type="dxa"/>
+              <w:right w:w="120" w:type="dxa"/>
+            </w:tcMar>
+          </w:tcPr>
+          <w:p>
+            <w:r>
+              <w:rPr>
+                <w:sz w:val="20"/>
+                <w:szCs w:val="20"/>
+              </w:rPr>
+              <w:t>C/Y=0 error</w:t>
+            </w:r>
+          </w:p>
+        </w:tc>
+        <w:tc>
+          <w:tcPr>
+            <w:tcW w:w="2600" w:type="dxa"/>
+            <w:tcBorders>
+              <w:top w:val="single" w:sz="1" w:space="0" w:color="CCCCCC"/>
+              <w:left w:val="single" w:sz="1" w:space="0" w:color="CCCCCC"/>
+              <w:bottom w:val="single" w:sz="1" w:space="0" w:color="CCCCCC"/>
+              <w:right w:val="single" w:sz="1" w:space="0" w:color="CCCCCC"/>
+            </w:tcBorders>
+            <w:tcMar>
+              <w:top w:w="80" w:type="dxa"/>
+              <w:left w:w="120" w:type="dxa"/>
+              <w:bottom w:w="80" w:type="dxa"/>
+              <w:right w:w="120" w:type="dxa"/>
+            </w:tcMar>
+          </w:tcPr>
+          <w:p>
+            <w:r>
+              <w:rPr>
+                <w:sz w:val="20"/>
+                <w:szCs w:val="20"/>
+              </w:rPr>
+              <w:t>C/Y=0</w:t>
+            </w:r>
+          </w:p>
+        </w:tc>
+        <w:tc>
+          <w:tcPr>
+            <w:tcW w:w="1800" w:type="dxa"/>
+            <w:tcBorders>
+              <w:top w:val="single" w:sz="1" w:space="0" w:color="CCCCCC"/>
+              <w:left w:val="single" w:sz="1" w:space="0" w:color="CCCCCC"/>
+              <w:bottom w:val="single" w:sz="1" w:space="0" w:color="CCCCCC"/>
+              <w:right w:val="single" w:sz="1" w:space="0" w:color="CCCCCC"/>
+            </w:tcBorders>
+            <w:tcMar>
+              <w:top w:w="80" w:type="dxa"/>
+              <w:left w:w="120" w:type="dxa"/>
+              <w:bottom w:w="80" w:type="dxa"/>
+              <w:right w:w="120" w:type="dxa"/>
+            </w:tcMar>
+          </w:tcPr>
+          <w:p>
             <w:r>
               <w:rPr>
                 <w:b/>
@@ -29062,178 +27458,7 @@
                 <w:sz w:val="20"/>
                 <w:szCs w:val="20"/>
               </w:rPr>
-              <w:t xml:space="preserve"> raised</w:t>
-            </w:r>
-          </w:p>
-        </w:tc>
-        <w:tc>
-          <w:tcPr>
-            <w:tcW w:w="960" w:type="dxa"/>
-            <w:tcBorders>
-              <w:top w:val="single" w:sz="1" w:space="0" w:color="CCCCCC"/>
-              <w:left w:val="single" w:sz="1" w:space="0" w:color="CCCCCC"/>
-              <w:bottom w:val="single" w:sz="1" w:space="0" w:color="CCCCCC"/>
-              <w:right w:val="single" w:sz="1" w:space="0" w:color="CCCCCC"/>
-            </w:tcBorders>
-            <w:tcMar>
-              <w:top w:w="80" w:type="dxa"/>
-              <w:left w:w="120" w:type="dxa"/>
-              <w:bottom w:w="80" w:type="dxa"/>
-              <w:right w:w="120" w:type="dxa"/>
-            </w:tcMar>
-          </w:tcPr>
-          <w:p>
-            <w:r>
-              <w:rPr>
-                <w:sz w:val="20"/>
-                <w:szCs w:val="20"/>
-              </w:rPr>
-              <w:t>Must error</w:t>
-            </w:r>
-          </w:p>
-        </w:tc>
-        <w:tc>
-          <w:tcPr>
-            <w:tcW w:w="500" w:type="dxa"/>
-            <w:tcBorders>
-              <w:top w:val="single" w:sz="1" w:space="0" w:color="CCCCCC"/>
-              <w:left w:val="single" w:sz="1" w:space="0" w:color="CCCCCC"/>
-              <w:bottom w:val="single" w:sz="1" w:space="0" w:color="CCCCCC"/>
-              <w:right w:val="single" w:sz="1" w:space="0" w:color="CCCCCC"/>
-            </w:tcBorders>
-            <w:tcMar>
-              <w:top w:w="80" w:type="dxa"/>
-              <w:left w:w="120" w:type="dxa"/>
-              <w:bottom w:w="80" w:type="dxa"/>
-              <w:right w:w="120" w:type="dxa"/>
-            </w:tcMar>
-          </w:tcPr>
-          <w:p/>
-        </w:tc>
-      </w:tr>
-      <w:tr>
-        <w:tblPrEx>
-          <w:tblCellMar>
-            <w:top w:w="0" w:type="dxa"/>
-            <w:bottom w:w="0" w:type="dxa"/>
-          </w:tblCellMar>
-        </w:tblPrEx>
-        <w:tc>
-          <w:tcPr>
-            <w:tcW w:w="500" w:type="dxa"/>
-            <w:tcBorders>
-              <w:top w:val="single" w:sz="1" w:space="0" w:color="CCCCCC"/>
-              <w:left w:val="single" w:sz="1" w:space="0" w:color="CCCCCC"/>
-              <w:bottom w:val="single" w:sz="1" w:space="0" w:color="CCCCCC"/>
-              <w:right w:val="single" w:sz="1" w:space="0" w:color="CCCCCC"/>
-            </w:tcBorders>
-            <w:tcMar>
-              <w:top w:w="80" w:type="dxa"/>
-              <w:left w:w="120" w:type="dxa"/>
-              <w:bottom w:w="80" w:type="dxa"/>
-              <w:right w:w="120" w:type="dxa"/>
-            </w:tcMar>
-          </w:tcPr>
-          <w:p>
-            <w:r>
-              <w:rPr>
-                <w:sz w:val="20"/>
-                <w:szCs w:val="20"/>
-              </w:rPr>
-              <w:t>3.06</w:t>
-            </w:r>
-          </w:p>
-        </w:tc>
-        <w:tc>
-          <w:tcPr>
-            <w:tcW w:w="2500" w:type="dxa"/>
-            <w:tcBorders>
-              <w:top w:val="single" w:sz="1" w:space="0" w:color="CCCCCC"/>
-              <w:left w:val="single" w:sz="1" w:space="0" w:color="CCCCCC"/>
-              <w:bottom w:val="single" w:sz="1" w:space="0" w:color="CCCCCC"/>
-              <w:right w:val="single" w:sz="1" w:space="0" w:color="CCCCCC"/>
-            </w:tcBorders>
-            <w:tcMar>
-              <w:top w:w="80" w:type="dxa"/>
-              <w:left w:w="120" w:type="dxa"/>
-              <w:bottom w:w="80" w:type="dxa"/>
-              <w:right w:w="120" w:type="dxa"/>
-            </w:tcMar>
-          </w:tcPr>
-          <w:p>
-            <w:r>
-              <w:rPr>
-                <w:sz w:val="20"/>
-                <w:szCs w:val="20"/>
-              </w:rPr>
-              <w:t>C/Y=0 error</w:t>
-            </w:r>
-          </w:p>
-        </w:tc>
-        <w:tc>
-          <w:tcPr>
-            <w:tcW w:w="2600" w:type="dxa"/>
-            <w:tcBorders>
-              <w:top w:val="single" w:sz="1" w:space="0" w:color="CCCCCC"/>
-              <w:left w:val="single" w:sz="1" w:space="0" w:color="CCCCCC"/>
-              <w:bottom w:val="single" w:sz="1" w:space="0" w:color="CCCCCC"/>
-              <w:right w:val="single" w:sz="1" w:space="0" w:color="CCCCCC"/>
-            </w:tcBorders>
-            <w:tcMar>
-              <w:top w:w="80" w:type="dxa"/>
-              <w:left w:w="120" w:type="dxa"/>
-              <w:bottom w:w="80" w:type="dxa"/>
-              <w:right w:w="120" w:type="dxa"/>
-            </w:tcMar>
-          </w:tcPr>
-          <w:p>
-            <w:r>
-              <w:rPr>
-                <w:sz w:val="20"/>
-                <w:szCs w:val="20"/>
-              </w:rPr>
-              <w:t>C/Y=0</w:t>
-            </w:r>
-          </w:p>
-        </w:tc>
-        <w:tc>
-          <w:tcPr>
-            <w:tcW w:w="1800" w:type="dxa"/>
-            <w:tcBorders>
-              <w:top w:val="single" w:sz="1" w:space="0" w:color="CCCCCC"/>
-              <w:left w:val="single" w:sz="1" w:space="0" w:color="CCCCCC"/>
-              <w:bottom w:val="single" w:sz="1" w:space="0" w:color="CCCCCC"/>
-              <w:right w:val="single" w:sz="1" w:space="0" w:color="CCCCCC"/>
-            </w:tcBorders>
-            <w:tcMar>
-              <w:top w:w="80" w:type="dxa"/>
-              <w:left w:w="120" w:type="dxa"/>
-              <w:bottom w:w="80" w:type="dxa"/>
-              <w:right w:w="120" w:type="dxa"/>
-            </w:tcMar>
-          </w:tcPr>
-          <w:p>
-            <w:proofErr w:type="spellStart"/>
-            <w:r>
-              <w:rPr>
-                <w:b/>
-                <w:bCs/>
-                <w:color w:val="1D6A2E"/>
-                <w:sz w:val="20"/>
-                <w:szCs w:val="20"/>
-              </w:rPr>
-              <w:t>ValueError</w:t>
-            </w:r>
-            <w:proofErr w:type="spellEnd"/>
-            <w:r>
-              <w:rPr>
-                <w:b/>
-                <w:bCs/>
-                <w:color w:val="1D6A2E"/>
-                <w:sz w:val="20"/>
-                <w:szCs w:val="20"/>
-              </w:rPr>
-              <w:t xml:space="preserve"> raised</w:t>
+              <w:t>ValueError raised</w:t>
             </w:r>
           </w:p>
         </w:tc>
@@ -29318,12 +27543,6 @@
         <w:gridCol w:w="830"/>
       </w:tblGrid>
       <w:tr>
-        <w:tblPrEx>
-          <w:tblCellMar>
-            <w:top w:w="0" w:type="dxa"/>
-            <w:bottom w:w="0" w:type="dxa"/>
-          </w:tblCellMar>
-        </w:tblPrEx>
         <w:trPr>
           <w:tblHeader/>
         </w:trPr>
@@ -29509,12 +27728,6 @@
         </w:tc>
       </w:tr>
       <w:tr>
-        <w:tblPrEx>
-          <w:tblCellMar>
-            <w:top w:w="0" w:type="dxa"/>
-            <w:bottom w:w="0" w:type="dxa"/>
-          </w:tblCellMar>
-        </w:tblPrEx>
         <w:tc>
           <w:tcPr>
             <w:tcW w:w="500" w:type="dxa"/>
@@ -29668,12 +27881,6 @@
         </w:tc>
       </w:tr>
       <w:tr>
-        <w:tblPrEx>
-          <w:tblCellMar>
-            <w:top w:w="0" w:type="dxa"/>
-            <w:bottom w:w="0" w:type="dxa"/>
-          </w:tblCellMar>
-        </w:tblPrEx>
         <w:tc>
           <w:tcPr>
             <w:tcW w:w="500" w:type="dxa"/>
@@ -29722,17 +27929,8 @@
                 <w:sz w:val="20"/>
                 <w:szCs w:val="20"/>
               </w:rPr>
-              <w:t xml:space="preserve">TVM status </w:t>
-            </w:r>
-            <w:proofErr w:type="spellStart"/>
-            <w:r>
-              <w:rPr>
-                <w:sz w:val="20"/>
-                <w:szCs w:val="20"/>
-              </w:rPr>
-              <w:t>dict</w:t>
-            </w:r>
-            <w:proofErr w:type="spellEnd"/>
+              <w:t>TVM status dict</w:t>
+            </w:r>
           </w:p>
         </w:tc>
         <w:tc>
@@ -29836,12 +28034,6 @@
         </w:tc>
       </w:tr>
       <w:tr>
-        <w:tblPrEx>
-          <w:tblCellMar>
-            <w:top w:w="0" w:type="dxa"/>
-            <w:bottom w:w="0" w:type="dxa"/>
-          </w:tblCellMar>
-        </w:tblPrEx>
         <w:tc>
           <w:tcPr>
             <w:tcW w:w="500" w:type="dxa"/>
@@ -29995,12 +28187,6 @@
         </w:tc>
       </w:tr>
       <w:tr>
-        <w:tblPrEx>
-          <w:tblCellMar>
-            <w:top w:w="0" w:type="dxa"/>
-            <w:bottom w:w="0" w:type="dxa"/>
-          </w:tblCellMar>
-        </w:tblPrEx>
         <w:tc>
           <w:tcPr>
             <w:tcW w:w="500" w:type="dxa"/>
@@ -30155,12 +28341,6 @@
         </w:tc>
       </w:tr>
       <w:tr>
-        <w:tblPrEx>
-          <w:tblCellMar>
-            <w:top w:w="0" w:type="dxa"/>
-            <w:bottom w:w="0" w:type="dxa"/>
-          </w:tblCellMar>
-        </w:tblPrEx>
         <w:tc>
           <w:tcPr>
             <w:tcW w:w="500" w:type="dxa"/>
@@ -30235,23 +28415,7 @@
                 <w:sz w:val="20"/>
                 <w:szCs w:val="20"/>
               </w:rPr>
-              <w:t xml:space="preserve">Press 5, </w:t>
-            </w:r>
-            <w:proofErr w:type="spellStart"/>
-            <w:r>
-              <w:rPr>
-                <w:sz w:val="20"/>
-                <w:szCs w:val="20"/>
-              </w:rPr>
-              <w:t>nCr</w:t>
-            </w:r>
-            <w:proofErr w:type="spellEnd"/>
-            <w:r>
-              <w:rPr>
-                <w:sz w:val="20"/>
-                <w:szCs w:val="20"/>
-              </w:rPr>
-              <w:t>, 5, =</w:t>
+              <w:t>Press 5, nCr, 5, =</w:t>
             </w:r>
           </w:p>
         </w:tc>
@@ -30330,12 +28494,6 @@
         </w:tc>
       </w:tr>
       <w:tr>
-        <w:tblPrEx>
-          <w:tblCellMar>
-            <w:top w:w="0" w:type="dxa"/>
-            <w:bottom w:w="0" w:type="dxa"/>
-          </w:tblCellMar>
-        </w:tblPrEx>
         <w:tc>
           <w:tcPr>
             <w:tcW w:w="500" w:type="dxa"/>
@@ -30556,67 +28714,7 @@
           <w:sz w:val="20"/>
           <w:szCs w:val="20"/>
         </w:rPr>
-        <w:t xml:space="preserve">NPV = CF0 + Σ [ </w:t>
-      </w:r>
-      <w:proofErr w:type="spellStart"/>
-      <w:r>
-        <w:rPr>
-          <w:rFonts w:ascii="Courier New" w:eastAsia="Courier New" w:hAnsi="Courier New" w:cs="Courier New"/>
-          <w:color w:val="003366"/>
-          <w:sz w:val="20"/>
-          <w:szCs w:val="20"/>
-        </w:rPr>
-        <w:t>CFj</w:t>
-      </w:r>
-      <w:proofErr w:type="spellEnd"/>
-      <w:r>
-        <w:rPr>
-          <w:rFonts w:ascii="Courier New" w:eastAsia="Courier New" w:hAnsi="Courier New" w:cs="Courier New"/>
-          <w:color w:val="003366"/>
-          <w:sz w:val="20"/>
-          <w:szCs w:val="20"/>
-        </w:rPr>
-        <w:t xml:space="preserve"> / (1 + </w:t>
-      </w:r>
-      <w:proofErr w:type="spellStart"/>
-      <w:r>
-        <w:rPr>
-          <w:rFonts w:ascii="Courier New" w:eastAsia="Courier New" w:hAnsi="Courier New" w:cs="Courier New"/>
-          <w:color w:val="003366"/>
-          <w:sz w:val="20"/>
-          <w:szCs w:val="20"/>
-        </w:rPr>
-        <w:t>i</w:t>
-      </w:r>
-      <w:proofErr w:type="spellEnd"/>
-      <w:r>
-        <w:rPr>
-          <w:rFonts w:ascii="Courier New" w:eastAsia="Courier New" w:hAnsi="Courier New" w:cs="Courier New"/>
-          <w:color w:val="003366"/>
-          <w:sz w:val="20"/>
-          <w:szCs w:val="20"/>
-        </w:rPr>
-        <w:t>)^</w:t>
-      </w:r>
-      <w:proofErr w:type="spellStart"/>
-      <w:r>
-        <w:rPr>
-          <w:rFonts w:ascii="Courier New" w:eastAsia="Courier New" w:hAnsi="Courier New" w:cs="Courier New"/>
-          <w:color w:val="003366"/>
-          <w:sz w:val="20"/>
-          <w:szCs w:val="20"/>
-        </w:rPr>
-        <w:t>Sj</w:t>
-      </w:r>
-      <w:proofErr w:type="spellEnd"/>
-      <w:r>
-        <w:rPr>
-          <w:rFonts w:ascii="Courier New" w:eastAsia="Courier New" w:hAnsi="Courier New" w:cs="Courier New"/>
-          <w:color w:val="003366"/>
-          <w:sz w:val="20"/>
-          <w:szCs w:val="20"/>
-        </w:rPr>
-        <w:t xml:space="preserve"> ]</w:t>
+        <w:t>NPV = CF0 + Σ [ CFj / (1 + i)^Sj ]</w:t>
       </w:r>
     </w:p>
     <w:p>
@@ -30624,23 +28722,7 @@
         <w:spacing w:after="120"/>
       </w:pPr>
       <w:r>
-        <w:t xml:space="preserve">where </w:t>
-      </w:r>
-      <w:proofErr w:type="spellStart"/>
-      <w:r>
-        <w:t>i</w:t>
-      </w:r>
-      <w:proofErr w:type="spellEnd"/>
-      <w:r>
-        <w:t xml:space="preserve"> = I/100 (discount rate as decimal), </w:t>
-      </w:r>
-      <w:proofErr w:type="spellStart"/>
-      <w:r>
-        <w:t>Sj</w:t>
-      </w:r>
-      <w:proofErr w:type="spellEnd"/>
-      <w:r>
-        <w:t xml:space="preserve"> = sum of frequencies up to period j</w:t>
+        <w:t>where i = I/100 (discount rate as decimal), Sj = sum of frequencies up to period j</w:t>
       </w:r>
     </w:p>
     <w:p/>
@@ -30657,15 +28739,7 @@
         <w:spacing w:after="120"/>
       </w:pPr>
       <w:r>
-        <w:t xml:space="preserve">IRR is the value of </w:t>
-      </w:r>
-      <w:proofErr w:type="spellStart"/>
-      <w:r>
-        <w:t>i</w:t>
-      </w:r>
-      <w:proofErr w:type="spellEnd"/>
-      <w:r>
-        <w:t xml:space="preserve"> (annual %) that makes NPV = 0. Found by Newton-Raphson iteration.</w:t>
+        <w:t>IRR is the value of i (annual %) that makes NPV = 0. Found by Newton-Raphson iteration.</w:t>
       </w:r>
     </w:p>
     <w:p/>
@@ -31182,6 +29256,155 @@
       </w:pPr>
     </w:lvl>
   </w:abstractNum>
+  <w:abstractNum w:abstractNumId="3" w15:restartNumberingAfterBreak="0">
+    <w:nsid w:val="74180DAA"/>
+    <w:multiLevelType w:val="multilevel"/>
+    <w:tmpl w:val="A770EFFC"/>
+    <w:lvl w:ilvl="0">
+      <w:start w:val="1"/>
+      <w:numFmt w:val="bullet"/>
+      <w:lvlText w:val=""/>
+      <w:lvlJc w:val="left"/>
+      <w:pPr>
+        <w:tabs>
+          <w:tab w:val="num" w:pos="720"/>
+        </w:tabs>
+        <w:ind w:left="720" w:hanging="360"/>
+      </w:pPr>
+      <w:rPr>
+        <w:rFonts w:ascii="Symbol" w:hAnsi="Symbol" w:hint="default"/>
+        <w:sz w:val="20"/>
+      </w:rPr>
+    </w:lvl>
+    <w:lvl w:ilvl="1" w:tentative="1">
+      <w:start w:val="1"/>
+      <w:numFmt w:val="bullet"/>
+      <w:lvlText w:val="o"/>
+      <w:lvlJc w:val="left"/>
+      <w:pPr>
+        <w:tabs>
+          <w:tab w:val="num" w:pos="1440"/>
+        </w:tabs>
+        <w:ind w:left="1440" w:hanging="360"/>
+      </w:pPr>
+      <w:rPr>
+        <w:rFonts w:ascii="Courier New" w:hAnsi="Courier New" w:hint="default"/>
+        <w:sz w:val="20"/>
+      </w:rPr>
+    </w:lvl>
+    <w:lvl w:ilvl="2" w:tentative="1">
+      <w:start w:val="1"/>
+      <w:numFmt w:val="bullet"/>
+      <w:lvlText w:val=""/>
+      <w:lvlJc w:val="left"/>
+      <w:pPr>
+        <w:tabs>
+          <w:tab w:val="num" w:pos="2160"/>
+        </w:tabs>
+        <w:ind w:left="2160" w:hanging="360"/>
+      </w:pPr>
+      <w:rPr>
+        <w:rFonts w:ascii="Wingdings" w:hAnsi="Wingdings" w:hint="default"/>
+        <w:sz w:val="20"/>
+      </w:rPr>
+    </w:lvl>
+    <w:lvl w:ilvl="3" w:tentative="1">
+      <w:start w:val="1"/>
+      <w:numFmt w:val="bullet"/>
+      <w:lvlText w:val=""/>
+      <w:lvlJc w:val="left"/>
+      <w:pPr>
+        <w:tabs>
+          <w:tab w:val="num" w:pos="2880"/>
+        </w:tabs>
+        <w:ind w:left="2880" w:hanging="360"/>
+      </w:pPr>
+      <w:rPr>
+        <w:rFonts w:ascii="Wingdings" w:hAnsi="Wingdings" w:hint="default"/>
+        <w:sz w:val="20"/>
+      </w:rPr>
+    </w:lvl>
+    <w:lvl w:ilvl="4" w:tentative="1">
+      <w:start w:val="1"/>
+      <w:numFmt w:val="bullet"/>
+      <w:lvlText w:val=""/>
+      <w:lvlJc w:val="left"/>
+      <w:pPr>
+        <w:tabs>
+          <w:tab w:val="num" w:pos="3600"/>
+        </w:tabs>
+        <w:ind w:left="3600" w:hanging="360"/>
+      </w:pPr>
+      <w:rPr>
+        <w:rFonts w:ascii="Wingdings" w:hAnsi="Wingdings" w:hint="default"/>
+        <w:sz w:val="20"/>
+      </w:rPr>
+    </w:lvl>
+    <w:lvl w:ilvl="5" w:tentative="1">
+      <w:start w:val="1"/>
+      <w:numFmt w:val="bullet"/>
+      <w:lvlText w:val=""/>
+      <w:lvlJc w:val="left"/>
+      <w:pPr>
+        <w:tabs>
+          <w:tab w:val="num" w:pos="4320"/>
+        </w:tabs>
+        <w:ind w:left="4320" w:hanging="360"/>
+      </w:pPr>
+      <w:rPr>
+        <w:rFonts w:ascii="Wingdings" w:hAnsi="Wingdings" w:hint="default"/>
+        <w:sz w:val="20"/>
+      </w:rPr>
+    </w:lvl>
+    <w:lvl w:ilvl="6" w:tentative="1">
+      <w:start w:val="1"/>
+      <w:numFmt w:val="bullet"/>
+      <w:lvlText w:val=""/>
+      <w:lvlJc w:val="left"/>
+      <w:pPr>
+        <w:tabs>
+          <w:tab w:val="num" w:pos="5040"/>
+        </w:tabs>
+        <w:ind w:left="5040" w:hanging="360"/>
+      </w:pPr>
+      <w:rPr>
+        <w:rFonts w:ascii="Wingdings" w:hAnsi="Wingdings" w:hint="default"/>
+        <w:sz w:val="20"/>
+      </w:rPr>
+    </w:lvl>
+    <w:lvl w:ilvl="7" w:tentative="1">
+      <w:start w:val="1"/>
+      <w:numFmt w:val="bullet"/>
+      <w:lvlText w:val=""/>
+      <w:lvlJc w:val="left"/>
+      <w:pPr>
+        <w:tabs>
+          <w:tab w:val="num" w:pos="5760"/>
+        </w:tabs>
+        <w:ind w:left="5760" w:hanging="360"/>
+      </w:pPr>
+      <w:rPr>
+        <w:rFonts w:ascii="Wingdings" w:hAnsi="Wingdings" w:hint="default"/>
+        <w:sz w:val="20"/>
+      </w:rPr>
+    </w:lvl>
+    <w:lvl w:ilvl="8" w:tentative="1">
+      <w:start w:val="1"/>
+      <w:numFmt w:val="bullet"/>
+      <w:lvlText w:val=""/>
+      <w:lvlJc w:val="left"/>
+      <w:pPr>
+        <w:tabs>
+          <w:tab w:val="num" w:pos="6480"/>
+        </w:tabs>
+        <w:ind w:left="6480" w:hanging="360"/>
+      </w:pPr>
+      <w:rPr>
+        <w:rFonts w:ascii="Wingdings" w:hAnsi="Wingdings" w:hint="default"/>
+        <w:sz w:val="20"/>
+      </w:rPr>
+    </w:lvl>
+  </w:abstractNum>
   <w:num w:numId="1" w16cid:durableId="1601067456">
     <w:abstractNumId w:val="2"/>
     <w:lvlOverride w:ilvl="0">
@@ -31199,6 +29422,9 @@
     <w:lvlOverride w:ilvl="0">
       <w:startOverride w:val="1"/>
     </w:lvlOverride>
+  </w:num>
+  <w:num w:numId="4" w16cid:durableId="600719456">
+    <w:abstractNumId w:val="3"/>
   </w:num>
 </w:numbering>
 </file>
@@ -31692,7 +29918,6 @@
   <w:style w:type="character" w:default="1" w:styleId="DefaultParagraphFont">
     <w:name w:val="Default Paragraph Font"/>
     <w:uiPriority w:val="1"/>
-    <w:semiHidden/>
     <w:unhideWhenUsed/>
   </w:style>
   <w:style w:type="table" w:default="1" w:styleId="TableNormal">

</xml_diff>